<commit_message>
CMS E6 L35/L36: guide links verified, Pip cards, Word copies, staging removed
- 29 guide-addition lines (35 question keys) from vetted explanations, so every
  L35/L36 question links to a passage that states its fact; Sonnet link judges:
  240 + 6 re-checked, guide links --strict OK (480/480 Exam 6 passages).
- Pip: 21 new cards for L35/L36 (independent Sonnet fact-check, lint, assemble);
  builder A's 50 cards re-attached to the renumbered units; u27 rehashed after
  checking its only change was two added lines swapping order. 71 cards, 0 errors.
- COPD callout: smoking-cessation emphasis from the recording (two transcripts agree).
- Word copies of the study guide, cram sheet and Clin Med Pro guide; cram-personal
  and planner resources regenerated; tools/cms_e6_staging/ removed (all spliced).

Co-Authored-By: Claude Opus 5.5 <noreply@anthropic.com>
</commit_message>
<xml_diff>
--- a/Clinical Medicine and Surgery I Exam 6/cms-exam-6-clin-med-pro-guide.docx
+++ b/Clinical Medicine and Surgery I Exam 6/cms-exam-6-clin-med-pro-guide.docx
@@ -278,7 +278,7 @@
                 <w:b w:val="0"/>
                 <w:i w:val="0"/>
               </w:rPr>
-              <w:t xml:space="preserve"> rather than filling the gap from elsewhere (9 of 40 fields in this exam; Mortality alone: 3 of 4). Slide numbers follow each field. Cards open closed; tap one to read it.</w:t>
+              <w:t xml:space="preserve"> rather than filling the gap from elsewhere (11 of 70 fields in this exam; Mortality alone: 4 of 7). Slide numbers follow each field. Cards open closed; tap one to read it.</w:t>
             </w:r>
           </w:p>
           <w:p>
@@ -1471,6 +1471,897 @@
           <w:i w:val="0"/>
         </w:rPr>
         <w:t>Slide 8</w:t>
+      </w:r>
+    </w:p>
+    <w:p>
+      <w:pPr>
+        <w:pStyle w:val="Heading1"/>
+        <w:spacing w:before="280" w:after="100"/>
+      </w:pPr>
+      <w:r>
+        <w:rPr>
+          <w:rFonts w:ascii="Georgia" w:hAnsi="Georgia"/>
+          <w:color w:val="7A2D30"/>
+        </w:rPr>
+        <w:t>Lecture 35 · Asthma</w:t>
+      </w:r>
+    </w:p>
+    <w:p>
+      <w:pPr>
+        <w:spacing w:after="120"/>
+      </w:pPr>
+      <w:r>
+        <w:rPr>
+          <w:b w:val="0"/>
+          <w:i w:val="0"/>
+        </w:rPr>
+        <w:t>Megan B. Finck, MMS, PA-C · 2 conditions · source: PAJ5500 CMSI Asthma MBF 2026sc.pptx</w:t>
+      </w:r>
+    </w:p>
+    <w:p>
+      <w:pPr>
+        <w:spacing w:after="120"/>
+      </w:pPr>
+      <w:r>
+        <w:rPr>
+          <w:b/>
+          <w:i w:val="0"/>
+        </w:rPr>
+        <w:t>Note:</w:t>
+      </w:r>
+      <w:r>
+        <w:rPr>
+          <w:b w:val="0"/>
+          <w:i w:val="0"/>
+        </w:rPr>
+        <w:t xml:space="preserve"> Built from the slides plus the lecture recording: the recording only chooses which facts to star, it adds no content. Adult content (12 and older) only; epidemiology numbers and emergency management are context, not tested. Brand names and dosing are left out. Where a slide is loose (high-dose inhaled steroid systemic effects, cromolyn filed under bronchodilators, the pneumococcal age band), the field says so or leaves it out.</w:t>
+      </w:r>
+    </w:p>
+    <w:p>
+      <w:pPr>
+        <w:spacing w:after="120"/>
+      </w:pPr>
+      <w:r>
+        <w:rPr>
+          <w:b w:val="0"/>
+          <w:i w:val="0"/>
+        </w:rPr>
+        <w:t>Asthma</w:t>
+      </w:r>
+      <w:r>
+        <w:rPr>
+          <w:b w:val="0"/>
+          <w:i w:val="0"/>
+        </w:rPr>
+        <w:t>★ Professor emphasized</w:t>
+      </w:r>
+    </w:p>
+    <w:p>
+      <w:pPr>
+        <w:spacing w:after="120"/>
+      </w:pPr>
+      <w:r>
+        <w:rPr>
+          <w:b w:val="0"/>
+          <w:i w:val="0"/>
+        </w:rPr>
+        <w:t>★ Classifying severity from a patient description (most severe feature wins), the written action plan and zones, inhaler and spacer technique, and drug classes rather than brands were stressed; epidemiology and emergency care are not tested.</w:t>
+      </w:r>
+    </w:p>
+    <w:p>
+      <w:pPr>
+        <w:spacing w:after="120"/>
+      </w:pPr>
+      <w:r>
+        <w:rPr>
+          <w:b w:val="0"/>
+          <w:i w:val="0"/>
+        </w:rPr>
+        <w:t>Name of Condition</w:t>
+      </w:r>
+      <w:r>
+        <w:rPr>
+          <w:b w:val="0"/>
+          <w:i w:val="0"/>
+        </w:rPr>
+        <w:t xml:space="preserve">Asthma (extrinsic and intrinsic types) </w:t>
+      </w:r>
+      <w:r>
+        <w:rPr>
+          <w:b w:val="0"/>
+          <w:i w:val="0"/>
+        </w:rPr>
+        <w:t>Slides 5, 34–36</w:t>
+      </w:r>
+      <w:r>
+        <w:rPr>
+          <w:b w:val="0"/>
+          <w:i w:val="0"/>
+        </w:rPr>
+        <w:t>Definition</w:t>
+      </w:r>
+      <w:r>
+        <w:rPr>
+          <w:b w:val="0"/>
+          <w:i w:val="0"/>
+          <w:highlight w:val="yellow"/>
+        </w:rPr>
+        <w:t>★ Chronic inflammatory airway disorder with reversible airflow obstruction</w:t>
+      </w:r>
+      <w:r>
+        <w:rPr>
+          <w:b w:val="0"/>
+          <w:i w:val="0"/>
+        </w:rPr>
+        <w:t xml:space="preserve"> (some long-standing cases irreversible): recurrent breathlessness and wheezing and difficulty getting air out. Airway hyper-responsiveness is excessive bronchoconstriction to a trigger a normal airway ignores </w:t>
+      </w:r>
+      <w:r>
+        <w:rPr>
+          <w:b w:val="0"/>
+          <w:i w:val="0"/>
+        </w:rPr>
+        <w:t>Slides 5, 7–11</w:t>
+      </w:r>
+      <w:r>
+        <w:rPr>
+          <w:b w:val="0"/>
+          <w:i w:val="0"/>
+        </w:rPr>
+        <w:t>Etiology (cause)</w:t>
+      </w:r>
+      <w:r>
+        <w:rPr>
+          <w:b w:val="0"/>
+          <w:i w:val="0"/>
+        </w:rPr>
+        <w:t xml:space="preserve">Not fully understood: genetic predisposition (polygenic) plus environment. </w:t>
+      </w:r>
+      <w:r>
+        <w:rPr>
+          <w:b w:val="0"/>
+          <w:i w:val="0"/>
+          <w:highlight w:val="yellow"/>
+        </w:rPr>
+        <w:t>★ Atopy</w:t>
+      </w:r>
+      <w:r>
+        <w:rPr>
+          <w:b w:val="0"/>
+          <w:i w:val="0"/>
+        </w:rPr>
+        <w:t xml:space="preserve"> (raised immunoglobulin E; atopic triad of allergic rhinitis, asthma, atopic dermatitis); obesity (body mass index above 30); early viral infection. Inhaled allergens (dust mites most common), occupational sensitizers, air pollution and passive smoke (controversial) </w:t>
+      </w:r>
+      <w:r>
+        <w:rPr>
+          <w:b w:val="0"/>
+          <w:i w:val="0"/>
+        </w:rPr>
+        <w:t>Slides 23–33</w:t>
+      </w:r>
+      <w:r>
+        <w:rPr>
+          <w:b w:val="0"/>
+          <w:i w:val="0"/>
+        </w:rPr>
+        <w:t>Epidemiology (who)</w:t>
+      </w:r>
+      <w:r>
+        <w:rPr>
+          <w:b w:val="0"/>
+          <w:i w:val="0"/>
+        </w:rPr>
+        <w:t xml:space="preserve">Any age, peak presentation at 3 years; may go quiet in adolescence and return in adulthood. Statistics were not tested. Severity rarely changes: mild rarely becomes severe, severe is usually severe at onset </w:t>
+      </w:r>
+      <w:r>
+        <w:rPr>
+          <w:b w:val="0"/>
+          <w:i w:val="0"/>
+        </w:rPr>
+        <w:t>Slides 12–13</w:t>
+      </w:r>
+      <w:r>
+        <w:rPr>
+          <w:b w:val="0"/>
+          <w:i w:val="0"/>
+        </w:rPr>
+        <w:t>Risk Factors</w:t>
+      </w:r>
+      <w:r>
+        <w:rPr>
+          <w:b w:val="0"/>
+          <w:i w:val="0"/>
+        </w:rPr>
+        <w:t xml:space="preserve">Atopy, family history, obesity, occupational exposure. Triggers: allergens, viral infections, aspirin and beta blockers, exercise, cold air, pollution, smoke, stress. Allergen avoidance does not reduce the risk of developing asthma. Death risk: frequent bronchodilator use, no or poorly taken inhaled corticosteroid, previous near-fatal admission </w:t>
+      </w:r>
+      <w:r>
+        <w:rPr>
+          <w:b w:val="0"/>
+          <w:i w:val="0"/>
+        </w:rPr>
+        <w:t>Slides 14, 24–32, 37–42</w:t>
+      </w:r>
+      <w:r>
+        <w:rPr>
+          <w:b w:val="0"/>
+          <w:i w:val="0"/>
+        </w:rPr>
+        <w:t>Pathology</w:t>
+      </w:r>
+      <w:r>
+        <w:rPr>
+          <w:b w:val="0"/>
+          <w:i w:val="0"/>
+        </w:rPr>
+        <w:t xml:space="preserve">Bronchoconstriction, airway edema, vascular congestion, mucus plugging; lowers the 1-second volume, its ratio to forced vital capacity, and peak flow. Extrinsic: allergen-triggered, most common. Intrinsic (about 10%): negative skin tests, normal immunoglobulin E, adult onset, usually more severe, nasal polyps, may be aspirin sensitive. Other types: occupational, catamenial, cardiac, exercise-induced, aspirin-sensitive </w:t>
+      </w:r>
+      <w:r>
+        <w:rPr>
+          <w:b w:val="0"/>
+          <w:i w:val="0"/>
+        </w:rPr>
+        <w:t>Slides 7–10, 34–36</w:t>
+      </w:r>
+      <w:r>
+        <w:rPr>
+          <w:b w:val="0"/>
+          <w:i w:val="0"/>
+        </w:rPr>
+        <w:t>Clinical Manifestation</w:t>
+      </w:r>
+      <w:r>
+        <w:rPr>
+          <w:b w:val="0"/>
+          <w:i w:val="0"/>
+        </w:rPr>
+        <w:t xml:space="preserve">Episodic wheeze, dyspnea, chest tightness, cough, sputum; worse at night (peak 3 to 4 in the morning); exam may be normal between exacerbations; extrinsic: swollen nasal mucosa, eczema, nasal polyps. Exacerbation: accessory muscle use, leaning forward; wheeze may disappear in a severe exacerbation </w:t>
+      </w:r>
+      <w:r>
+        <w:rPr>
+          <w:b w:val="0"/>
+          <w:i w:val="0"/>
+        </w:rPr>
+        <w:t>Slides 45–51</w:t>
+      </w:r>
+      <w:r>
+        <w:rPr>
+          <w:b w:val="0"/>
+          <w:i w:val="0"/>
+        </w:rPr>
+        <w:t>Diagnosis</w:t>
+      </w:r>
+      <w:r>
+        <w:rPr>
+          <w:b w:val="0"/>
+          <w:i w:val="0"/>
+          <w:highlight w:val="yellow"/>
+        </w:rPr>
+        <w:t>★ Spirometry before and after a short-acting bronchodilator</w:t>
+      </w:r>
+      <w:r>
+        <w:rPr>
+          <w:b w:val="0"/>
+          <w:i w:val="0"/>
+        </w:rPr>
+        <w:t xml:space="preserve">: reduced 1-second volume and ratio; improvement of 12% or more supports asthma; repeat yearly. Provocation testing if nondiagnostic (not below 65% predicted); exercise challenge; allergy testing; exhaled nitric oxide. Home peak flow: 20% change = poor control. </w:t>
+      </w:r>
+      <w:r>
+        <w:rPr>
+          <w:b w:val="0"/>
+          <w:i w:val="0"/>
+          <w:highlight w:val="yellow"/>
+        </w:rPr>
+        <w:t>★ Severity (12 and older): intermittent, mild, moderate, severe persistent by symptoms, nights, rescue use, activity limit and 1-second volume; most severe feature wins</w:t>
+      </w:r>
+      <w:r>
+        <w:rPr>
+          <w:b w:val="0"/>
+          <w:i w:val="0"/>
+        </w:rPr>
+        <w:t xml:space="preserve"> </w:t>
+      </w:r>
+      <w:r>
+        <w:rPr>
+          <w:b w:val="0"/>
+          <w:i w:val="0"/>
+        </w:rPr>
+        <w:t>Slides 52–61, 69</w:t>
+      </w:r>
+      <w:r>
+        <w:rPr>
+          <w:b w:val="0"/>
+          <w:i w:val="0"/>
+        </w:rPr>
+        <w:t>Treatment/Therapy</w:t>
+      </w:r>
+      <w:r>
+        <w:rPr>
+          <w:b w:val="0"/>
+          <w:i w:val="0"/>
+        </w:rPr>
+        <w:t xml:space="preserve">Trigger avoidance; every patient needs a short-acting beta-2 agonist; </w:t>
+      </w:r>
+      <w:r>
+        <w:rPr>
+          <w:b w:val="0"/>
+          <w:i w:val="0"/>
+          <w:highlight w:val="yellow"/>
+        </w:rPr>
+        <w:t>★ inhaled corticosteroid first-line for persistent asthma</w:t>
+      </w:r>
+      <w:r>
+        <w:rPr>
+          <w:b w:val="0"/>
+          <w:i w:val="0"/>
+        </w:rPr>
+        <w:t xml:space="preserve"> (spacer, rinse); long-acting beta-2 agonist only with an inhaled steroid; add-ons: leukotriene modifier, cromolyn, tiotropium, theophylline (rarely); monoclonal antibodies by specialists; short systemic steroid course for exacerbations, none long-term unless refractory. Avoid aspirin, non-selective anti-inflammatory drugs and beta blockers. Written action plan with zones; vaccines (caution with intranasal influenza); check compliance and technique first when control is poor </w:t>
+      </w:r>
+      <w:r>
+        <w:rPr>
+          <w:b w:val="0"/>
+          <w:i w:val="0"/>
+        </w:rPr>
+        <w:t>Slides 66–96</w:t>
+      </w:r>
+      <w:r>
+        <w:rPr>
+          <w:b w:val="0"/>
+          <w:i w:val="0"/>
+        </w:rPr>
+        <w:t>Mortality ★</w:t>
+      </w:r>
+      <w:r>
+        <w:rPr>
+          <w:b w:val="0"/>
+          <w:i w:val="0"/>
+        </w:rPr>
+        <w:t xml:space="preserve">Death uncommon; declining in affluent countries with widespread use of inhaled corticosteroids. Death risk: frequent bronchodilator use, no or poorly taken inhaled corticosteroid, previous near-fatal admission </w:t>
+      </w:r>
+      <w:r>
+        <w:rPr>
+          <w:b w:val="0"/>
+          <w:i w:val="0"/>
+        </w:rPr>
+        <w:t>Slides 13–14</w:t>
+      </w:r>
+    </w:p>
+    <w:p>
+      <w:pPr>
+        <w:spacing w:after="120"/>
+      </w:pPr>
+      <w:r>
+        <w:rPr>
+          <w:b w:val="0"/>
+          <w:i w:val="0"/>
+        </w:rPr>
+        <w:t>Allergic bronchopulmonary aspergillosis</w:t>
+      </w:r>
+      <w:r>
+        <w:rPr>
+          <w:b w:val="0"/>
+          <w:i w:val="0"/>
+        </w:rPr>
+        <w:t>2 not covered</w:t>
+      </w:r>
+      <w:r>
+        <w:br/>
+      </w:r>
+      <w:r>
+        <w:rPr>
+          <w:b w:val="0"/>
+          <w:i w:val="0"/>
+        </w:rPr>
+        <w:t>Name of Condition</w:t>
+      </w:r>
+      <w:r>
+        <w:rPr>
+          <w:b w:val="0"/>
+          <w:i w:val="0"/>
+        </w:rPr>
+        <w:t xml:space="preserve">Allergic bronchopulmonary aspergillosis </w:t>
+      </w:r>
+      <w:r>
+        <w:rPr>
+          <w:b w:val="0"/>
+          <w:i w:val="0"/>
+        </w:rPr>
+        <w:t>Slide 65</w:t>
+      </w:r>
+      <w:r>
+        <w:rPr>
+          <w:b w:val="0"/>
+          <w:i w:val="0"/>
+        </w:rPr>
+        <w:t>Definition</w:t>
+      </w:r>
+      <w:r>
+        <w:rPr>
+          <w:b w:val="0"/>
+          <w:i w:val="0"/>
+        </w:rPr>
+        <w:t xml:space="preserve">Hypersensitivity reaction to Aspergillus species (Aspergillus fumigatus) </w:t>
+      </w:r>
+      <w:r>
+        <w:rPr>
+          <w:b w:val="0"/>
+          <w:i w:val="0"/>
+        </w:rPr>
+        <w:t>Slide 65</w:t>
+      </w:r>
+      <w:r>
+        <w:rPr>
+          <w:b w:val="0"/>
+          <w:i w:val="0"/>
+        </w:rPr>
+        <w:t>Etiology (cause)</w:t>
+      </w:r>
+      <w:r>
+        <w:rPr>
+          <w:b w:val="0"/>
+          <w:i w:val="0"/>
+        </w:rPr>
+        <w:t xml:space="preserve">Exposure to Aspergillus in a patient with asthma or cystic fibrosis </w:t>
+      </w:r>
+      <w:r>
+        <w:rPr>
+          <w:b w:val="0"/>
+          <w:i w:val="0"/>
+        </w:rPr>
+        <w:t>Slide 65</w:t>
+      </w:r>
+      <w:r>
+        <w:rPr>
+          <w:b w:val="0"/>
+          <w:i w:val="0"/>
+        </w:rPr>
+        <w:t>Epidemiology (who)</w:t>
+      </w:r>
+      <w:r>
+        <w:rPr>
+          <w:b w:val="0"/>
+          <w:i w:val="0"/>
+        </w:rPr>
+        <w:t xml:space="preserve">Occurs almost exclusively with asthma or cystic fibrosis </w:t>
+      </w:r>
+      <w:r>
+        <w:rPr>
+          <w:b w:val="0"/>
+          <w:i w:val="0"/>
+        </w:rPr>
+        <w:t>Slide 65</w:t>
+      </w:r>
+      <w:r>
+        <w:rPr>
+          <w:b w:val="0"/>
+          <w:i w:val="0"/>
+        </w:rPr>
+        <w:t>Risk Factors</w:t>
+      </w:r>
+      <w:r>
+        <w:rPr>
+          <w:b w:val="0"/>
+          <w:i w:val="0"/>
+        </w:rPr>
+        <w:t xml:space="preserve">Asthma; cystic fibrosis </w:t>
+      </w:r>
+      <w:r>
+        <w:rPr>
+          <w:b w:val="0"/>
+          <w:i w:val="0"/>
+        </w:rPr>
+        <w:t>Slide 65</w:t>
+      </w:r>
+      <w:r>
+        <w:rPr>
+          <w:b w:val="0"/>
+          <w:i w:val="0"/>
+        </w:rPr>
+        <w:t>Pathology</w:t>
+      </w:r>
+      <w:r>
+        <w:rPr>
+          <w:b w:val="0"/>
+          <w:i w:val="0"/>
+        </w:rPr>
+        <w:t xml:space="preserve">Vigorous immunoglobulin E and G antibody response to Aspergillus fumigatus </w:t>
+      </w:r>
+      <w:r>
+        <w:rPr>
+          <w:b w:val="0"/>
+          <w:i w:val="0"/>
+        </w:rPr>
+        <w:t>Slide 65</w:t>
+      </w:r>
+      <w:r>
+        <w:rPr>
+          <w:b w:val="0"/>
+          <w:i w:val="0"/>
+        </w:rPr>
+        <w:t>Clinical Manifestation</w:t>
+      </w:r>
+      <w:r>
+        <w:rPr>
+          <w:b w:val="0"/>
+          <w:i w:val="0"/>
+        </w:rPr>
+        <w:t xml:space="preserve">Acute asthma symptoms and exacerbations despite good control </w:t>
+      </w:r>
+      <w:r>
+        <w:rPr>
+          <w:b w:val="0"/>
+          <w:i w:val="0"/>
+        </w:rPr>
+        <w:t>Slide 65</w:t>
+      </w:r>
+      <w:r>
+        <w:rPr>
+          <w:b w:val="0"/>
+          <w:i w:val="0"/>
+        </w:rPr>
+        <w:t>Diagnosis</w:t>
+      </w:r>
+      <w:r>
+        <w:rPr>
+          <w:b w:val="0"/>
+          <w:i w:val="0"/>
+        </w:rPr>
+        <w:t xml:space="preserve">Raised immunoglobulin E and G antibodies to Aspergillus fumigatus </w:t>
+      </w:r>
+      <w:r>
+        <w:rPr>
+          <w:b w:val="0"/>
+          <w:i w:val="0"/>
+        </w:rPr>
+        <w:t>Slide 65</w:t>
+      </w:r>
+      <w:r>
+        <w:rPr>
+          <w:b w:val="0"/>
+          <w:i w:val="0"/>
+        </w:rPr>
+        <w:t>Treatment/Therapy</w:t>
+      </w:r>
+      <w:r>
+        <w:rPr>
+          <w:b w:val="0"/>
+          <w:i w:val="0"/>
+        </w:rPr>
+        <w:t>Not covered in the lecture</w:t>
+      </w:r>
+      <w:r>
+        <w:rPr>
+          <w:b w:val="0"/>
+          <w:i w:val="0"/>
+        </w:rPr>
+        <w:t>Mortality ★</w:t>
+      </w:r>
+      <w:r>
+        <w:rPr>
+          <w:b w:val="0"/>
+          <w:i w:val="0"/>
+        </w:rPr>
+        <w:t>Not covered in the lecture</w:t>
+      </w:r>
+    </w:p>
+    <w:p>
+      <w:pPr>
+        <w:pStyle w:val="Heading1"/>
+        <w:spacing w:before="280" w:after="100"/>
+      </w:pPr>
+      <w:r>
+        <w:rPr>
+          <w:rFonts w:ascii="Georgia" w:hAnsi="Georgia"/>
+          <w:color w:val="7A2D30"/>
+        </w:rPr>
+        <w:t>Lecture 36 · Chronic Obstructive Pulmonary Disease</w:t>
+      </w:r>
+    </w:p>
+    <w:p>
+      <w:pPr>
+        <w:spacing w:after="120"/>
+      </w:pPr>
+      <w:r>
+        <w:rPr>
+          <w:b w:val="0"/>
+          <w:i w:val="0"/>
+        </w:rPr>
+        <w:t>Lauren Reynolds, MSPA, PA-C · 1 conditions · source: 37. svCOPD 2026.pptx</w:t>
+      </w:r>
+    </w:p>
+    <w:p>
+      <w:pPr>
+        <w:spacing w:after="120"/>
+      </w:pPr>
+      <w:r>
+        <w:rPr>
+          <w:b/>
+          <w:i w:val="0"/>
+        </w:rPr>
+        <w:t>Note:</w:t>
+      </w:r>
+      <w:r>
+        <w:rPr>
+          <w:b w:val="0"/>
+          <w:i w:val="0"/>
+        </w:rPr>
+        <w:t xml:space="preserve"> Built from the slides plus the lecture recording: the recording only chooses which facts to star, it adds no content. Both the 2020 four-group (A to D) and the 2023 and 2026 three-group (A, B, E) schemes are on the slides. Where the lecturer said any single exacerbation makes a patient high risk, the slides' definition (2 or more moderate, or 1 leading to hospitalization) is used. Brand names, device brands and dosing are left out.</w:t>
+      </w:r>
+    </w:p>
+    <w:p>
+      <w:pPr>
+        <w:spacing w:after="120"/>
+      </w:pPr>
+      <w:r>
+        <w:rPr>
+          <w:b w:val="0"/>
+          <w:i w:val="0"/>
+        </w:rPr>
+        <w:t>Chronic obstructive pulmonary disease (COPD)</w:t>
+      </w:r>
+      <w:r>
+        <w:rPr>
+          <w:b w:val="0"/>
+          <w:i w:val="0"/>
+        </w:rPr>
+        <w:t>★ Professor emphasized</w:t>
+      </w:r>
+    </w:p>
+    <w:p>
+      <w:pPr>
+        <w:spacing w:after="120"/>
+      </w:pPr>
+      <w:r>
+        <w:rPr>
+          <w:b w:val="0"/>
+          <w:i w:val="0"/>
+        </w:rPr>
+        <w:t>★ The group (symptoms times risk) sets the treatment; know both the 2020 A to D and the current A, B, E schemes; spirometry confirms the diagnosis; the airflow grade, assessment test, dyspnea grade and BODE score are testable calculations.</w:t>
+      </w:r>
+    </w:p>
+    <w:p>
+      <w:pPr>
+        <w:spacing w:after="120"/>
+      </w:pPr>
+      <w:r>
+        <w:rPr>
+          <w:b w:val="0"/>
+          <w:i w:val="0"/>
+        </w:rPr>
+        <w:t>Name of Condition</w:t>
+      </w:r>
+      <w:r>
+        <w:rPr>
+          <w:b w:val="0"/>
+          <w:i w:val="0"/>
+        </w:rPr>
+        <w:t xml:space="preserve">Chronic obstructive pulmonary disease (COPD) / chronic obstructive lung disease (COLD) </w:t>
+      </w:r>
+      <w:r>
+        <w:rPr>
+          <w:b w:val="0"/>
+          <w:i w:val="0"/>
+        </w:rPr>
+        <w:t>Slides 1, 5</w:t>
+      </w:r>
+      <w:r>
+        <w:rPr>
+          <w:b w:val="0"/>
+          <w:i w:val="0"/>
+        </w:rPr>
+        <w:t>Definition</w:t>
+      </w:r>
+      <w:r>
+        <w:rPr>
+          <w:b w:val="0"/>
+          <w:i w:val="0"/>
+          <w:highlight w:val="yellow"/>
+        </w:rPr>
+        <w:t>★ Persistent airflow obstruction plus respiratory symptoms</w:t>
+      </w:r>
+      <w:r>
+        <w:rPr>
+          <w:b w:val="0"/>
+          <w:i w:val="0"/>
+        </w:rPr>
+        <w:t xml:space="preserve"> caused by inhaled particulate exposure in the setting of genetic, developmental and social factors; an umbrella of chronic bronchitis and emphysema. Chronic bronchitis without airflow obstruction is not COPD </w:t>
+      </w:r>
+      <w:r>
+        <w:rPr>
+          <w:b w:val="0"/>
+          <w:i w:val="0"/>
+        </w:rPr>
+        <w:t>Slides 5–7</w:t>
+      </w:r>
+      <w:r>
+        <w:rPr>
+          <w:b w:val="0"/>
+          <w:i w:val="0"/>
+        </w:rPr>
+        <w:t>Etiology (cause)</w:t>
+      </w:r>
+      <w:r>
+        <w:rPr>
+          <w:b w:val="0"/>
+          <w:i w:val="0"/>
+          <w:highlight w:val="yellow"/>
+        </w:rPr>
+        <w:t>★ Tobacco smoke (about 90%)</w:t>
+      </w:r>
+      <w:r>
+        <w:rPr>
+          <w:b w:val="0"/>
+          <w:i w:val="0"/>
+        </w:rPr>
+        <w:t xml:space="preserve">; biomass burning (indoor cooking and heating, major in low- and middle-income countries); occupational coal dust, gold mining, welding, fumes; alpha-1 antitrypsin deficiency (about 3 to 4 per 10,000); sedentary lifestyle </w:t>
+      </w:r>
+      <w:r>
+        <w:rPr>
+          <w:b w:val="0"/>
+          <w:i w:val="0"/>
+        </w:rPr>
+        <w:t>Slides 10–12, 19</w:t>
+      </w:r>
+      <w:r>
+        <w:rPr>
+          <w:b w:val="0"/>
+          <w:i w:val="0"/>
+        </w:rPr>
+        <w:t>Epidemiology (who)</w:t>
+      </w:r>
+      <w:r>
+        <w:rPr>
+          <w:b w:val="0"/>
+          <w:i w:val="0"/>
+        </w:rPr>
+        <w:t xml:space="preserve">About 6% of Americans; third leading cause of death worldwide (2023); underdiagnosis very common; symptoms begin in midlife </w:t>
+      </w:r>
+      <w:r>
+        <w:rPr>
+          <w:b w:val="0"/>
+          <w:i w:val="0"/>
+        </w:rPr>
+        <w:t>Slides 8–9</w:t>
+      </w:r>
+      <w:r>
+        <w:rPr>
+          <w:b w:val="0"/>
+          <w:i w:val="0"/>
+        </w:rPr>
+        <w:t>Risk Factors</w:t>
+      </w:r>
+      <w:r>
+        <w:rPr>
+          <w:b w:val="0"/>
+          <w:i w:val="0"/>
+        </w:rPr>
+        <w:t xml:space="preserve">Smoking, biomass smoke, occupational exposures, alpha-1 antitrypsin deficiency (age 45 or under, nonsmoker, basilar emphysema, family history), inactivity </w:t>
+      </w:r>
+      <w:r>
+        <w:rPr>
+          <w:b w:val="0"/>
+          <w:i w:val="0"/>
+        </w:rPr>
+        <w:t>Slides 10–12, 19</w:t>
+      </w:r>
+      <w:r>
+        <w:rPr>
+          <w:b w:val="0"/>
+          <w:i w:val="0"/>
+        </w:rPr>
+        <w:t>Pathology</w:t>
+      </w:r>
+      <w:r>
+        <w:rPr>
+          <w:b w:val="0"/>
+          <w:i w:val="0"/>
+        </w:rPr>
+        <w:t xml:space="preserve">Chronic inflammation, oxidative stress, protease-antiprotease imbalance. Chronic bronchitis subtype: airway narrowing and mucus plugging. Emphysema subtype: alveolar destruction and loss of elastic recoil; centrilobular upper-lobe in smokers, panlobular lower-lobe in alpha-1 antitrypsin deficiency. Air trapping and hyperinflation </w:t>
+      </w:r>
+      <w:r>
+        <w:rPr>
+          <w:b w:val="0"/>
+          <w:i w:val="0"/>
+        </w:rPr>
+        <w:t>Slides 6–7, 11–15, 25</w:t>
+      </w:r>
+      <w:r>
+        <w:rPr>
+          <w:b w:val="0"/>
+          <w:i w:val="0"/>
+        </w:rPr>
+        <w:t>Clinical Manifestation</w:t>
+      </w:r>
+      <w:r>
+        <w:rPr>
+          <w:b w:val="0"/>
+          <w:i w:val="0"/>
+        </w:rPr>
+        <w:t xml:space="preserve">Progressive dyspnea (exertional dyspnea is the early sign), chronic cough, sputum, wheeze. Blue bloater (chronic bronchitis): sputum, rhonchi, cyanosis, edema. Pink puffer (emphysema): thin, pursed lips, barrel chest, distant breath sounds. Cor pulmonale, syncope, falls. Screen for heart disease, lung cancer, osteoporosis, depression, reflux, anemia </w:t>
+      </w:r>
+      <w:r>
+        <w:rPr>
+          <w:b w:val="0"/>
+          <w:i w:val="0"/>
+        </w:rPr>
+        <w:t>Slides 14–22</w:t>
+      </w:r>
+      <w:r>
+        <w:rPr>
+          <w:b w:val="0"/>
+          <w:i w:val="0"/>
+        </w:rPr>
+        <w:t>Diagnosis</w:t>
+      </w:r>
+      <w:r>
+        <w:rPr>
+          <w:b w:val="0"/>
+          <w:i w:val="0"/>
+          <w:highlight w:val="yellow"/>
+        </w:rPr>
+        <w:t>★ Spirometry before and after a bronchodilator: ratio below 0.70</w:t>
+      </w:r>
+      <w:r>
+        <w:rPr>
+          <w:b w:val="0"/>
+          <w:i w:val="0"/>
+        </w:rPr>
+        <w:t xml:space="preserve">; response under 12% = irreversible. Airflow grade by 1-second volume: 1 at 80% or more, 2 at 50 to 79%, 3 at 30 to 49%, 4 below 30%. Assessment test 10 or more or dyspnea grade 2 or more = more symptoms. Low diffusing capacity = emphysema. Alpha-1 antitrypsin level below 11 micromol/L. Blood gas only in severe exacerbations </w:t>
+      </w:r>
+      <w:r>
+        <w:rPr>
+          <w:b w:val="0"/>
+          <w:i w:val="0"/>
+        </w:rPr>
+        <w:t>Slides 23–31, 34–37</w:t>
+      </w:r>
+      <w:r>
+        <w:rPr>
+          <w:b w:val="0"/>
+          <w:i w:val="0"/>
+        </w:rPr>
+        <w:t>Treatment/Therapy</w:t>
+      </w:r>
+      <w:r>
+        <w:rPr>
+          <w:b w:val="0"/>
+          <w:i w:val="0"/>
+          <w:highlight w:val="yellow"/>
+        </w:rPr>
+        <w:t>★ Group sets treatment</w:t>
+      </w:r>
+      <w:r>
+        <w:rPr>
+          <w:b w:val="0"/>
+          <w:i w:val="0"/>
+        </w:rPr>
+        <w:t xml:space="preserve">: A one bronchodilator; B long-acting beta agonist plus antimuscarinic; E the same pair, add inhaled steroid if eosinophils 300 or more. Inhaled steroid never alone. Oral steroids for exacerbations only. Smoking cessation with counseling, pulmonary rehabilitation (B and E), yearly influenza and pneumococcal vaccines, albuterol rescue. Long-term oxygen for arterial oxygen under 55 mmHg or saturation below 88%. Exacerbation: bronchodilators, steroids, antibiotics if more and purulent sputum, noninvasive ventilation for hypercapnia. Older adults: spacer or soft mist devices, active rehabilitation referral, early palliative care </w:t>
+      </w:r>
+      <w:r>
+        <w:rPr>
+          <w:b w:val="0"/>
+          <w:i w:val="0"/>
+        </w:rPr>
+        <w:t>Slides 38–51, 53–64</w:t>
+      </w:r>
+      <w:r>
+        <w:rPr>
+          <w:b w:val="0"/>
+          <w:i w:val="0"/>
+        </w:rPr>
+        <w:t>Mortality ★</w:t>
+      </w:r>
+      <w:r>
+        <w:rPr>
+          <w:b w:val="0"/>
+          <w:i w:val="0"/>
+        </w:rPr>
+        <w:t xml:space="preserve">BODE index (body mass index, obstruction, dyspnea, exercise) estimates 4-year survival: 0 to 2 points about 80%, 3 to 4 about 67%, 5 to 6 about 57%, 7 to 10 about 18%. Survival benefit: smoking cessation, long-term oxygen, noninvasive ventilation </w:t>
+      </w:r>
+      <w:r>
+        <w:rPr>
+          <w:b w:val="0"/>
+          <w:i w:val="0"/>
+        </w:rPr>
+        <w:t>Slides 52, 63</w:t>
       </w:r>
     </w:p>
     <w:sectPr>

</xml_diff>

<commit_message>
CMS I Exam 6 L37-38: Pip cards, Word copies, masters intro wording
- Pip: 85 new cards for Lecture 37 (63) and Lecture 38 (22), each written
  from its study-guide section and then checked sentence by sentence by an
  independent fact-checker (47 cards corrected, 1 added, 1 duplicate vaccine
  card dropped). 156 Exam 6 cards; pip_explain check: 0 errors, 0 stale.
- Word copies rebuilt one file at a time: study guide, cram sheet, Clinical
  Medicine Pro guide.
- Master exam intro: "Some of the questions are not in the topic quizzes"
  (fresh items are 5-15 per form, not "many").
- check_all "Clinical Medicine and Surgery I Exam 6": 0 hard failures.

Co-Authored-By: Claude Opus 5.5 <noreply@anthropic.com>
</commit_message>
<xml_diff>
--- a/Clinical Medicine and Surgery I Exam 6/cms-exam-6-clin-med-pro-guide.docx
+++ b/Clinical Medicine and Surgery I Exam 6/cms-exam-6-clin-med-pro-guide.docx
@@ -278,7 +278,7 @@
                 <w:b w:val="0"/>
                 <w:i w:val="0"/>
               </w:rPr>
-              <w:t xml:space="preserve"> rather than filling the gap from elsewhere (11 of 70 fields in this exam; Mortality alone: 4 of 7). Slide numbers follow each field. Cards open closed; tap one to read it.</w:t>
+              <w:t xml:space="preserve"> rather than filling the gap from elsewhere (25 of 220 fields in this exam; Mortality alone: 14 of 22). Slide numbers follow each field. Cards open closed; tap one to read it.</w:t>
             </w:r>
           </w:p>
           <w:p>
@@ -2362,6 +2362,3899 @@
           <w:i w:val="0"/>
         </w:rPr>
         <w:t>Slides 52, 63</w:t>
+      </w:r>
+    </w:p>
+    <w:p>
+      <w:pPr>
+        <w:pStyle w:val="Heading1"/>
+        <w:spacing w:before="280" w:after="100"/>
+      </w:pPr>
+      <w:r>
+        <w:rPr>
+          <w:rFonts w:ascii="Georgia" w:hAnsi="Georgia"/>
+          <w:color w:val="7A2D30"/>
+        </w:rPr>
+        <w:t>Lecture 37 · Respiratory Infections and Vaccines</w:t>
+      </w:r>
+    </w:p>
+    <w:p>
+      <w:pPr>
+        <w:spacing w:after="120"/>
+      </w:pPr>
+      <w:r>
+        <w:rPr>
+          <w:b w:val="0"/>
+          <w:i w:val="0"/>
+        </w:rPr>
+        <w:t>Robert Bobilin, MS, MPAS, PA-C (guest lecturer) · 12 conditions · source: 37. Respiratory Infections - Bobilin - 10-29-2026 SV.pptx</w:t>
+      </w:r>
+    </w:p>
+    <w:p>
+      <w:pPr>
+        <w:spacing w:after="120"/>
+      </w:pPr>
+      <w:r>
+        <w:rPr>
+          <w:b/>
+          <w:i w:val="0"/>
+        </w:rPr>
+        <w:t>Note:</w:t>
+      </w:r>
+      <w:r>
+        <w:rPr>
+          <w:b w:val="0"/>
+          <w:i w:val="0"/>
+        </w:rPr>
+        <w:t xml:space="preserve"> Built from the slides plus the Zoom recording: the recording only chooses which facts to star, it adds no content. The lecturer said vaccines will not be asked in much detail, the example chest films will not be shown as 'what is it', and he promised exam guidance after the lecture. Brand names and dosing are left out.</w:t>
+      </w:r>
+    </w:p>
+    <w:p>
+      <w:pPr>
+        <w:spacing w:after="120"/>
+      </w:pPr>
+      <w:r>
+        <w:rPr>
+          <w:b w:val="0"/>
+          <w:i w:val="0"/>
+        </w:rPr>
+        <w:t>Acute bronchitis</w:t>
+      </w:r>
+      <w:r>
+        <w:rPr>
+          <w:b w:val="0"/>
+          <w:i w:val="0"/>
+        </w:rPr>
+        <w:t>★ Professor emphasized</w:t>
+      </w:r>
+      <w:r>
+        <w:rPr>
+          <w:b w:val="0"/>
+          <w:i w:val="0"/>
+        </w:rPr>
+        <w:t>1 not covered</w:t>
+      </w:r>
+    </w:p>
+    <w:p>
+      <w:pPr>
+        <w:spacing w:after="120"/>
+      </w:pPr>
+      <w:r>
+        <w:rPr>
+          <w:b w:val="0"/>
+          <w:i w:val="0"/>
+        </w:rPr>
+        <w:t>★ His theme: 'diagnostic restraint' - no routine antibiotics, whatever the sputum color or cough duration.</w:t>
+      </w:r>
+    </w:p>
+    <w:p>
+      <w:pPr>
+        <w:spacing w:after="120"/>
+      </w:pPr>
+      <w:r>
+        <w:rPr>
+          <w:b w:val="0"/>
+          <w:i w:val="0"/>
+        </w:rPr>
+        <w:t>Name of Condition</w:t>
+      </w:r>
+      <w:r>
+        <w:rPr>
+          <w:b w:val="0"/>
+          <w:i w:val="0"/>
+        </w:rPr>
+        <w:t xml:space="preserve">Acute bronchitis </w:t>
+      </w:r>
+      <w:r>
+        <w:rPr>
+          <w:b w:val="0"/>
+          <w:i w:val="0"/>
+        </w:rPr>
+        <w:t>Slides 14–15</w:t>
+      </w:r>
+      <w:r>
+        <w:rPr>
+          <w:b w:val="0"/>
+          <w:i w:val="0"/>
+        </w:rPr>
+        <w:t>Definition</w:t>
+      </w:r>
+      <w:r>
+        <w:rPr>
+          <w:b w:val="0"/>
+          <w:i w:val="0"/>
+        </w:rPr>
+        <w:t xml:space="preserve">A usually self-limited viral infection of the large airways; inflammation and mucus cause cough, sometimes with transient wheeze </w:t>
+      </w:r>
+      <w:r>
+        <w:rPr>
+          <w:b w:val="0"/>
+          <w:i w:val="0"/>
+        </w:rPr>
+        <w:t>Slide 15</w:t>
+      </w:r>
+      <w:r>
+        <w:rPr>
+          <w:b w:val="0"/>
+          <w:i w:val="0"/>
+        </w:rPr>
+        <w:t>Etiology (cause)</w:t>
+      </w:r>
+      <w:r>
+        <w:rPr>
+          <w:b w:val="0"/>
+          <w:i w:val="0"/>
+        </w:rPr>
+        <w:t xml:space="preserve">Most uncomplicated episodes are viral; bacterial causes are uncommon. Consider pertussis with paroxysmal cough, post-tussive vomiting, whoop or exposure </w:t>
+      </w:r>
+      <w:r>
+        <w:rPr>
+          <w:b w:val="0"/>
+          <w:i w:val="0"/>
+        </w:rPr>
+        <w:t>Slides 17–18</w:t>
+      </w:r>
+      <w:r>
+        <w:rPr>
+          <w:b w:val="0"/>
+          <w:i w:val="0"/>
+        </w:rPr>
+        <w:t>Epidemiology (who)</w:t>
+      </w:r>
+      <w:r>
+        <w:rPr>
+          <w:b w:val="0"/>
+          <w:i w:val="0"/>
+        </w:rPr>
+        <w:t xml:space="preserve">Follows cold-like symptoms; cough commonly lasts 2 to 3 weeks and may persist longer </w:t>
+      </w:r>
+      <w:r>
+        <w:rPr>
+          <w:b w:val="0"/>
+          <w:i w:val="0"/>
+        </w:rPr>
+        <w:t>Slides 16–17</w:t>
+      </w:r>
+      <w:r>
+        <w:rPr>
+          <w:b w:val="0"/>
+          <w:i w:val="0"/>
+        </w:rPr>
+        <w:t>Risk Factors</w:t>
+      </w:r>
+      <w:r>
+        <w:rPr>
+          <w:b w:val="0"/>
+          <w:i w:val="0"/>
+        </w:rPr>
+        <w:t xml:space="preserve">A preceding viral upper respiratory infection; smoke and irritants worsen symptoms </w:t>
+      </w:r>
+      <w:r>
+        <w:rPr>
+          <w:b w:val="0"/>
+          <w:i w:val="0"/>
+        </w:rPr>
+        <w:t>Slides 16, 19</w:t>
+      </w:r>
+      <w:r>
+        <w:rPr>
+          <w:b w:val="0"/>
+          <w:i w:val="0"/>
+        </w:rPr>
+        <w:t>Pathology</w:t>
+      </w:r>
+      <w:r>
+        <w:rPr>
+          <w:b w:val="0"/>
+          <w:i w:val="0"/>
+        </w:rPr>
+        <w:t xml:space="preserve">Inflammation and mucus in the large airways; wheeze depends on the severity of airflow limitation </w:t>
+      </w:r>
+      <w:r>
+        <w:rPr>
+          <w:b w:val="0"/>
+          <w:i w:val="0"/>
+        </w:rPr>
+        <w:t>Slides 15–16</w:t>
+      </w:r>
+      <w:r>
+        <w:rPr>
+          <w:b w:val="0"/>
+          <w:i w:val="0"/>
+        </w:rPr>
+        <w:t>Clinical Manifestation</w:t>
+      </w:r>
+      <w:r>
+        <w:rPr>
+          <w:b w:val="0"/>
+          <w:i w:val="0"/>
+        </w:rPr>
+        <w:t>Low-grade fever, chills, aches, then cough with mucus, worst in the morning (</w:t>
+      </w:r>
+      <w:r>
+        <w:rPr>
+          <w:b w:val="0"/>
+          <w:i w:val="0"/>
+          <w:highlight w:val="yellow"/>
+        </w:rPr>
+        <w:t>★ green or yellow mucus does not mean bacteria</w:t>
+      </w:r>
+      <w:r>
+        <w:rPr>
+          <w:b w:val="0"/>
+          <w:i w:val="0"/>
+        </w:rPr>
+        <w:t xml:space="preserve">); dyspnea, wheeze, chest tightness, throat tickle. Exam: central (substernal) wheeze, rhonchi that clear with cough, chest-wall tenderness; consolidation means think pneumonia </w:t>
+      </w:r>
+      <w:r>
+        <w:rPr>
+          <w:b w:val="0"/>
+          <w:i w:val="0"/>
+        </w:rPr>
+        <w:t>Slides 16–17</w:t>
+      </w:r>
+      <w:r>
+        <w:rPr>
+          <w:b w:val="0"/>
+          <w:i w:val="0"/>
+        </w:rPr>
+        <w:t>Diagnosis</w:t>
+      </w:r>
+      <w:r>
+        <w:rPr>
+          <w:b w:val="0"/>
+          <w:i w:val="0"/>
+          <w:highlight w:val="yellow"/>
+        </w:rPr>
+        <w:t>★ Clinical diagnosis</w:t>
+      </w:r>
+      <w:r>
+        <w:rPr>
+          <w:b w:val="0"/>
+          <w:i w:val="0"/>
+        </w:rPr>
+        <w:t xml:space="preserve">; no routine complete blood count, sputum culture or chest film in uncomplicated cases (a blood count cannot tell viral from bacterial); image when vital signs, focal findings or risk suggest pneumonia; test for pertussis, influenza or COVID-19 when it changes care </w:t>
+      </w:r>
+      <w:r>
+        <w:rPr>
+          <w:b w:val="0"/>
+          <w:i w:val="0"/>
+        </w:rPr>
+        <w:t>Slides 15, 17</w:t>
+      </w:r>
+      <w:r>
+        <w:rPr>
+          <w:b w:val="0"/>
+          <w:i w:val="0"/>
+        </w:rPr>
+        <w:t>Treatment/Therapy</w:t>
+      </w:r>
+      <w:r>
+        <w:rPr>
+          <w:b w:val="0"/>
+          <w:i w:val="0"/>
+          <w:highlight w:val="yellow"/>
+        </w:rPr>
+        <w:t>★ No routine antibiotics</w:t>
+      </w:r>
+      <w:r>
+        <w:rPr>
+          <w:b w:val="0"/>
+          <w:i w:val="0"/>
+        </w:rPr>
+        <w:t xml:space="preserve"> (amoxicillin/clavulanate, clindamycin and fluoroquinolones are not default treatments); expectation setting, rest, fluids, avoiding smoke, acetaminophen (avoid duplicate acetaminophen in combination products); no routine opioid cough suppressants or corticosteroids; bronchodilator trial for selected wheezing patients; delayed 'pocket' prescription; return for dyspnea, hemoptysis, persistent fever, hypoxemia or worsening </w:t>
+      </w:r>
+      <w:r>
+        <w:rPr>
+          <w:b w:val="0"/>
+          <w:i w:val="0"/>
+        </w:rPr>
+        <w:t>Slides 18–22</w:t>
+      </w:r>
+      <w:r>
+        <w:rPr>
+          <w:b w:val="0"/>
+          <w:i w:val="0"/>
+        </w:rPr>
+        <w:t>Mortality ★</w:t>
+      </w:r>
+      <w:r>
+        <w:rPr>
+          <w:b w:val="0"/>
+          <w:i w:val="0"/>
+        </w:rPr>
+        <w:t>Not covered in the lecture</w:t>
+      </w:r>
+    </w:p>
+    <w:p>
+      <w:pPr>
+        <w:spacing w:after="120"/>
+      </w:pPr>
+      <w:r>
+        <w:rPr>
+          <w:b w:val="0"/>
+          <w:i w:val="0"/>
+        </w:rPr>
+        <w:t>Community-acquired pneumonia (bacterial)</w:t>
+      </w:r>
+      <w:r>
+        <w:rPr>
+          <w:b w:val="0"/>
+          <w:i w:val="0"/>
+        </w:rPr>
+        <w:t>★ Professor emphasized</w:t>
+      </w:r>
+    </w:p>
+    <w:p>
+      <w:pPr>
+        <w:spacing w:after="120"/>
+      </w:pPr>
+      <w:r>
+        <w:rPr>
+          <w:b w:val="0"/>
+          <w:i w:val="0"/>
+        </w:rPr>
+        <w:t>★ PSI is the preferred admission tool and CURB-65 is complementary; know the outpatient and inpatient regimens and when to withhold antibiotics.</w:t>
+      </w:r>
+    </w:p>
+    <w:p>
+      <w:pPr>
+        <w:spacing w:after="120"/>
+      </w:pPr>
+      <w:r>
+        <w:rPr>
+          <w:b w:val="0"/>
+          <w:i w:val="0"/>
+        </w:rPr>
+        <w:t>Name of Condition</w:t>
+      </w:r>
+      <w:r>
+        <w:rPr>
+          <w:b w:val="0"/>
+          <w:i w:val="0"/>
+        </w:rPr>
+        <w:t xml:space="preserve">Community-acquired pneumonia (CAP) </w:t>
+      </w:r>
+      <w:r>
+        <w:rPr>
+          <w:b w:val="0"/>
+          <w:i w:val="0"/>
+        </w:rPr>
+        <w:t>Slides 23, 25</w:t>
+      </w:r>
+      <w:r>
+        <w:rPr>
+          <w:b w:val="0"/>
+          <w:i w:val="0"/>
+        </w:rPr>
+        <w:t>Definition</w:t>
+      </w:r>
+      <w:r>
+        <w:rPr>
+          <w:b w:val="0"/>
+          <w:i w:val="0"/>
+        </w:rPr>
+        <w:t xml:space="preserve">Acute infection of the lung parenchyma and alveolar sacs, acquired outside the hospital or present early in admission; prior healthcare contact does not exclude it </w:t>
+      </w:r>
+      <w:r>
+        <w:rPr>
+          <w:b w:val="0"/>
+          <w:i w:val="0"/>
+        </w:rPr>
+        <w:t>Slides 25, 27</w:t>
+      </w:r>
+      <w:r>
+        <w:rPr>
+          <w:b w:val="0"/>
+          <w:i w:val="0"/>
+        </w:rPr>
+        <w:t>Etiology (cause)</w:t>
+      </w:r>
+      <w:r>
+        <w:rPr>
+          <w:b w:val="0"/>
+          <w:i w:val="0"/>
+          <w:highlight w:val="yellow"/>
+        </w:rPr>
+        <w:t>★ Streptococcus pneumoniae is the most common pathogen</w:t>
+      </w:r>
+      <w:r>
+        <w:rPr>
+          <w:b w:val="0"/>
+          <w:i w:val="0"/>
+        </w:rPr>
+        <w:t xml:space="preserve">; Haemophilus influenzae, respiratory viruses; atypicals Mycoplasma pneumoniae, Chlamydophila pneumoniae and Legionella (cruises, hot tubs, fountains); Klebsiella, Moraxella, MRSA (methicillin-resistant Staphylococcus aureus), Pseudomonas </w:t>
+      </w:r>
+      <w:r>
+        <w:rPr>
+          <w:b w:val="0"/>
+          <w:i w:val="0"/>
+        </w:rPr>
+        <w:t>Slides 24, 39–41</w:t>
+      </w:r>
+      <w:r>
+        <w:rPr>
+          <w:b w:val="0"/>
+          <w:i w:val="0"/>
+        </w:rPr>
+        <w:t>Epidemiology (who)</w:t>
+      </w:r>
+      <w:r>
+        <w:rPr>
+          <w:b w:val="0"/>
+          <w:i w:val="0"/>
+        </w:rPr>
+        <w:t xml:space="preserve">About 24.8 cases per 10,000 adults a year; highest incidence over 65; 15 to 20% hospitalized; influenza and pneumonia together are the 8th leading cause of death </w:t>
+      </w:r>
+      <w:r>
+        <w:rPr>
+          <w:b w:val="0"/>
+          <w:i w:val="0"/>
+        </w:rPr>
+        <w:t>Slide 24</w:t>
+      </w:r>
+      <w:r>
+        <w:rPr>
+          <w:b w:val="0"/>
+          <w:i w:val="0"/>
+        </w:rPr>
+        <w:t>Risk Factors</w:t>
+      </w:r>
+      <w:r>
+        <w:rPr>
+          <w:b w:val="0"/>
+          <w:i w:val="0"/>
+        </w:rPr>
+        <w:t xml:space="preserve">Age (young children, older adults), immunocompromise, sick contacts, alcohol and smoking, aspiration, chronic obstructive pulmonary disease and heart disease </w:t>
+      </w:r>
+      <w:r>
+        <w:rPr>
+          <w:b w:val="0"/>
+          <w:i w:val="0"/>
+        </w:rPr>
+        <w:t>Slides 28, 41</w:t>
+      </w:r>
+      <w:r>
+        <w:rPr>
+          <w:b w:val="0"/>
+          <w:i w:val="0"/>
+        </w:rPr>
+        <w:t>Pathology</w:t>
+      </w:r>
+      <w:r>
+        <w:rPr>
+          <w:b w:val="0"/>
+          <w:i w:val="0"/>
+        </w:rPr>
+        <w:t xml:space="preserve">Stages: congestion, red hepatization, gray hepatization, resolution (not hard rules) </w:t>
+      </w:r>
+      <w:r>
+        <w:rPr>
+          <w:b w:val="0"/>
+          <w:i w:val="0"/>
+        </w:rPr>
+        <w:t>Slide 26</w:t>
+      </w:r>
+      <w:r>
+        <w:rPr>
+          <w:b w:val="0"/>
+          <w:i w:val="0"/>
+        </w:rPr>
+        <w:t>Clinical Manifestation</w:t>
+      </w:r>
+      <w:r>
+        <w:rPr>
+          <w:b w:val="0"/>
+          <w:i w:val="0"/>
+        </w:rPr>
+        <w:t xml:space="preserve">Higher fevers and chills, pleuritic or stabbing chest pain, productive possibly purulent cough, dyspnea and tachypnea; sepsis signs when systemic. Exam: crackles or diminished sounds over one lobe, dullness, egophony (E to A), whispered pectoriloquy, increased tactile fremitus, pleural rub </w:t>
+      </w:r>
+      <w:r>
+        <w:rPr>
+          <w:b w:val="0"/>
+          <w:i w:val="0"/>
+        </w:rPr>
+        <w:t>Slides 23, 27–28</w:t>
+      </w:r>
+      <w:r>
+        <w:rPr>
+          <w:b w:val="0"/>
+          <w:i w:val="0"/>
+        </w:rPr>
+        <w:t>Diagnosis</w:t>
+      </w:r>
+      <w:r>
+        <w:rPr>
+          <w:b w:val="0"/>
+          <w:i w:val="0"/>
+          <w:highlight w:val="yellow"/>
+        </w:rPr>
+        <w:t>★ Chest radiograph</w:t>
+      </w:r>
+      <w:r>
+        <w:rPr>
+          <w:b w:val="0"/>
+          <w:i w:val="0"/>
+        </w:rPr>
+        <w:t xml:space="preserve"> (lung ultrasound with expertise); oxygen saturation, vital signs, organ function, sepsis risk; </w:t>
+      </w:r>
+      <w:r>
+        <w:rPr>
+          <w:b w:val="0"/>
+          <w:i w:val="0"/>
+          <w:highlight w:val="yellow"/>
+        </w:rPr>
+        <w:t>★ Pneumonia Severity Index plus judgment for admission; CURB-65 complementary</w:t>
+      </w:r>
+      <w:r>
+        <w:rPr>
+          <w:b w:val="0"/>
+          <w:i w:val="0"/>
+        </w:rPr>
+        <w:t xml:space="preserve"> (0 to 1 home, 2 hospital, 3 to 5 high severity); cultures only for severe disease, resistance risk or failure; computed tomography for uncertainty or cavitation </w:t>
+      </w:r>
+      <w:r>
+        <w:rPr>
+          <w:b w:val="0"/>
+          <w:i w:val="0"/>
+        </w:rPr>
+        <w:t>Slides 29–31, 33, 37, 45</w:t>
+      </w:r>
+      <w:r>
+        <w:rPr>
+          <w:b w:val="0"/>
+          <w:i w:val="0"/>
+        </w:rPr>
+        <w:t>Treatment/Therapy</w:t>
+      </w:r>
+      <w:r>
+        <w:rPr>
+          <w:b w:val="0"/>
+          <w:i w:val="0"/>
+        </w:rPr>
+        <w:t xml:space="preserve">Outpatient, healthy: amoxicillin or doxycycline (macrolide alone only if pneumococcal resistance below 25%). Outpatient with comorbidities: amoxicillin/clavulanate, cefpodoxime or cefuroxime plus azithromycin or doxycycline, or a respiratory fluoroquinolone. Inpatient nonsevere: beta-lactam plus macrolide, or a fluoroquinolone alone. Severe: beta-lactam plus azithromycin or a fluoroquinolone. Minimum 3 days (nonsevere), at least 5 days (severe). No routine steroids in nonsevere disease </w:t>
+      </w:r>
+      <w:r>
+        <w:rPr>
+          <w:b w:val="0"/>
+          <w:i w:val="0"/>
+        </w:rPr>
+        <w:t>Slides 38, 40, 43–45, 47</w:t>
+      </w:r>
+      <w:r>
+        <w:rPr>
+          <w:b w:val="0"/>
+          <w:i w:val="0"/>
+        </w:rPr>
+        <w:t>Mortality ★</w:t>
+      </w:r>
+      <w:r>
+        <w:rPr>
+          <w:b w:val="0"/>
+          <w:i w:val="0"/>
+        </w:rPr>
+        <w:t xml:space="preserve">CURB-65 risk of death: under 3% (0 to 1), 9% (2), 15 to 40% (3 to 5). Pneumonia Severity Index class mortality: I 0.1%, II 0.6%, III 0.9%, intravenous 9.3%, V 27.0% </w:t>
+      </w:r>
+      <w:r>
+        <w:rPr>
+          <w:b w:val="0"/>
+          <w:i w:val="0"/>
+        </w:rPr>
+        <w:t>Slides 30–31</w:t>
+      </w:r>
+    </w:p>
+    <w:p>
+      <w:pPr>
+        <w:spacing w:after="120"/>
+      </w:pPr>
+      <w:r>
+        <w:rPr>
+          <w:b w:val="0"/>
+          <w:i w:val="0"/>
+        </w:rPr>
+        <w:t>Hospital-acquired and ventilator-associated pneumonia</w:t>
+      </w:r>
+      <w:r>
+        <w:rPr>
+          <w:b w:val="0"/>
+          <w:i w:val="0"/>
+        </w:rPr>
+        <w:t>1 not covered</w:t>
+      </w:r>
+      <w:r>
+        <w:br/>
+      </w:r>
+      <w:r>
+        <w:rPr>
+          <w:b w:val="0"/>
+          <w:i w:val="0"/>
+        </w:rPr>
+        <w:t>Name of Condition</w:t>
+      </w:r>
+      <w:r>
+        <w:rPr>
+          <w:b w:val="0"/>
+          <w:i w:val="0"/>
+        </w:rPr>
+        <w:t xml:space="preserve">Hospital-acquired pneumonia (HAP) and ventilator-associated pneumonia (VAP) </w:t>
+      </w:r>
+      <w:r>
+        <w:rPr>
+          <w:b w:val="0"/>
+          <w:i w:val="0"/>
+        </w:rPr>
+        <w:t>Slide 25</w:t>
+      </w:r>
+      <w:r>
+        <w:rPr>
+          <w:b w:val="0"/>
+          <w:i w:val="0"/>
+        </w:rPr>
+        <w:t>Definition</w:t>
+      </w:r>
+      <w:r>
+        <w:rPr>
+          <w:b w:val="0"/>
+          <w:i w:val="0"/>
+        </w:rPr>
+        <w:t xml:space="preserve">HAP develops 48 hours or more after admission and was not incubating on admission; VAP develops more than 48 hours after endotracheal intubation </w:t>
+      </w:r>
+      <w:r>
+        <w:rPr>
+          <w:b w:val="0"/>
+          <w:i w:val="0"/>
+        </w:rPr>
+        <w:t>Slide 25</w:t>
+      </w:r>
+      <w:r>
+        <w:rPr>
+          <w:b w:val="0"/>
+          <w:i w:val="0"/>
+        </w:rPr>
+        <w:t>Etiology (cause)</w:t>
+      </w:r>
+      <w:r>
+        <w:rPr>
+          <w:b w:val="0"/>
+          <w:i w:val="0"/>
+        </w:rPr>
+        <w:t xml:space="preserve">Staphylococcus aureus and gram-negative bacilli including Pseudomonas and Enterobacterales; VAP more likely Pseudomonas or multidrug-resistant organisms </w:t>
+      </w:r>
+      <w:r>
+        <w:rPr>
+          <w:b w:val="0"/>
+          <w:i w:val="0"/>
+        </w:rPr>
+        <w:t>Slides 39, 48</w:t>
+      </w:r>
+      <w:r>
+        <w:rPr>
+          <w:b w:val="0"/>
+          <w:i w:val="0"/>
+        </w:rPr>
+        <w:t>Epidemiology (who)</w:t>
+      </w:r>
+      <w:r>
+        <w:rPr>
+          <w:b w:val="0"/>
+          <w:i w:val="0"/>
+        </w:rPr>
+        <w:t>Not covered in the lecture</w:t>
+      </w:r>
+      <w:r>
+        <w:rPr>
+          <w:b w:val="0"/>
+          <w:i w:val="0"/>
+        </w:rPr>
+        <w:t>Risk Factors</w:t>
+      </w:r>
+      <w:r>
+        <w:rPr>
+          <w:b w:val="0"/>
+          <w:i w:val="0"/>
+        </w:rPr>
+        <w:t xml:space="preserve">Ventilator circuits contaminated by flora, secretions, hands of healthcare workers, circuit changes, tube biofilm, prior antibiotics </w:t>
+      </w:r>
+      <w:r>
+        <w:rPr>
+          <w:b w:val="0"/>
+          <w:i w:val="0"/>
+        </w:rPr>
+        <w:t>Slide 48</w:t>
+      </w:r>
+      <w:r>
+        <w:rPr>
+          <w:b w:val="0"/>
+          <w:i w:val="0"/>
+        </w:rPr>
+        <w:t>Pathology</w:t>
+      </w:r>
+      <w:r>
+        <w:rPr>
+          <w:b w:val="0"/>
+          <w:i w:val="0"/>
+        </w:rPr>
+        <w:t xml:space="preserve">Colonized secretions are inhaled into the lungs through the endotracheal tube </w:t>
+      </w:r>
+      <w:r>
+        <w:rPr>
+          <w:b w:val="0"/>
+          <w:i w:val="0"/>
+        </w:rPr>
+        <w:t>Slide 48</w:t>
+      </w:r>
+      <w:r>
+        <w:rPr>
+          <w:b w:val="0"/>
+          <w:i w:val="0"/>
+        </w:rPr>
+        <w:t>Clinical Manifestation</w:t>
+      </w:r>
+      <w:r>
+        <w:rPr>
+          <w:b w:val="0"/>
+          <w:i w:val="0"/>
+        </w:rPr>
+        <w:t xml:space="preserve">A new pneumonia during admission or ventilation </w:t>
+      </w:r>
+      <w:r>
+        <w:rPr>
+          <w:b w:val="0"/>
+          <w:i w:val="0"/>
+        </w:rPr>
+        <w:t>Slide 25</w:t>
+      </w:r>
+      <w:r>
+        <w:rPr>
+          <w:b w:val="0"/>
+          <w:i w:val="0"/>
+        </w:rPr>
+        <w:t>Diagnosis</w:t>
+      </w:r>
+      <w:r>
+        <w:rPr>
+          <w:b w:val="0"/>
+          <w:i w:val="0"/>
+        </w:rPr>
+        <w:t xml:space="preserve">Respiratory cultures; local antibiogram, prior cultures and recent antibiotics; early or late timing alone does not select the regimen </w:t>
+      </w:r>
+      <w:r>
+        <w:rPr>
+          <w:b w:val="0"/>
+          <w:i w:val="0"/>
+        </w:rPr>
+        <w:t>Slides 39, 42, 46</w:t>
+      </w:r>
+      <w:r>
+        <w:rPr>
+          <w:b w:val="0"/>
+          <w:i w:val="0"/>
+        </w:rPr>
+        <w:t>Treatment/Therapy</w:t>
+      </w:r>
+      <w:r>
+        <w:rPr>
+          <w:b w:val="0"/>
+          <w:i w:val="0"/>
+        </w:rPr>
+        <w:t xml:space="preserve">Antipseudomonal beta-lactam with methicillin-sensitive staphylococcal coverage (piperacillin/tazobactam or cefepime); add vancomycin or linezolid for methicillin-resistant S. aureus risk; a second antipseudomonal class for selected high-risk patients; de-escalate; usually 7 days. VAP prevention: early extubation, hand washing, sterile technique, fewer circuit changes, head of bed elevated, secretion drainage and mouth care </w:t>
+      </w:r>
+      <w:r>
+        <w:rPr>
+          <w:b w:val="0"/>
+          <w:i w:val="0"/>
+        </w:rPr>
+        <w:t>Slides 42, 46, 49</w:t>
+      </w:r>
+      <w:r>
+        <w:rPr>
+          <w:b w:val="0"/>
+          <w:i w:val="0"/>
+        </w:rPr>
+        <w:t>Mortality ★</w:t>
+      </w:r>
+      <w:r>
+        <w:rPr>
+          <w:b w:val="0"/>
+          <w:i w:val="0"/>
+        </w:rPr>
+        <w:t xml:space="preserve">VAP: higher mortality and prolonged intensive care stay </w:t>
+      </w:r>
+      <w:r>
+        <w:rPr>
+          <w:b w:val="0"/>
+          <w:i w:val="0"/>
+        </w:rPr>
+        <w:t>Slide 48</w:t>
+      </w:r>
+    </w:p>
+    <w:p>
+      <w:pPr>
+        <w:spacing w:after="120"/>
+      </w:pPr>
+      <w:r>
+        <w:rPr>
+          <w:b w:val="0"/>
+          <w:i w:val="0"/>
+        </w:rPr>
+        <w:t>Aspiration pneumonia (and pneumonitis)</w:t>
+      </w:r>
+      <w:r>
+        <w:rPr>
+          <w:b w:val="0"/>
+          <w:i w:val="0"/>
+        </w:rPr>
+        <w:t>1 not covered</w:t>
+      </w:r>
+      <w:r>
+        <w:br/>
+      </w:r>
+      <w:r>
+        <w:rPr>
+          <w:b w:val="0"/>
+          <w:i w:val="0"/>
+        </w:rPr>
+        <w:t>Name of Condition</w:t>
+      </w:r>
+      <w:r>
+        <w:rPr>
+          <w:b w:val="0"/>
+          <w:i w:val="0"/>
+        </w:rPr>
+        <w:t xml:space="preserve">Aspiration pneumonia versus aspiration pneumonitis </w:t>
+      </w:r>
+      <w:r>
+        <w:rPr>
+          <w:b w:val="0"/>
+          <w:i w:val="0"/>
+        </w:rPr>
+        <w:t>Slides 50–51</w:t>
+      </w:r>
+      <w:r>
+        <w:rPr>
+          <w:b w:val="0"/>
+          <w:i w:val="0"/>
+        </w:rPr>
+        <w:t>Definition</w:t>
+      </w:r>
+      <w:r>
+        <w:rPr>
+          <w:b w:val="0"/>
+          <w:i w:val="0"/>
+        </w:rPr>
+        <w:t xml:space="preserve">Aspiration pneumonia: bacterial infection after aspiration of colonized oropharyngeal material. Pneumonitis: sterile chemical injury, often after gastric aspiration </w:t>
+      </w:r>
+      <w:r>
+        <w:rPr>
+          <w:b w:val="0"/>
+          <w:i w:val="0"/>
+        </w:rPr>
+        <w:t>Slides 50–51</w:t>
+      </w:r>
+      <w:r>
+        <w:rPr>
+          <w:b w:val="0"/>
+          <w:i w:val="0"/>
+        </w:rPr>
+        <w:t>Etiology (cause)</w:t>
+      </w:r>
+      <w:r>
+        <w:rPr>
+          <w:b w:val="0"/>
+          <w:i w:val="0"/>
+        </w:rPr>
+        <w:t xml:space="preserve">Anaerobic oral flora and varied organisms; pneumonitis is chemical, not infectious </w:t>
+      </w:r>
+      <w:r>
+        <w:rPr>
+          <w:b w:val="0"/>
+          <w:i w:val="0"/>
+        </w:rPr>
+        <w:t>Slides 28, 41</w:t>
+      </w:r>
+      <w:r>
+        <w:rPr>
+          <w:b w:val="0"/>
+          <w:i w:val="0"/>
+        </w:rPr>
+        <w:t>Epidemiology (who)</w:t>
+      </w:r>
+      <w:r>
+        <w:rPr>
+          <w:b w:val="0"/>
+          <w:i w:val="0"/>
+        </w:rPr>
+        <w:t xml:space="preserve">Can occur in community or hospital settings; elderly patients with dysphagia </w:t>
+      </w:r>
+      <w:r>
+        <w:rPr>
+          <w:b w:val="0"/>
+          <w:i w:val="0"/>
+        </w:rPr>
+        <w:t>Slides 25, 50</w:t>
+      </w:r>
+      <w:r>
+        <w:rPr>
+          <w:b w:val="0"/>
+          <w:i w:val="0"/>
+        </w:rPr>
+        <w:t>Risk Factors</w:t>
+      </w:r>
+      <w:r>
+        <w:rPr>
+          <w:b w:val="0"/>
+          <w:i w:val="0"/>
+        </w:rPr>
+        <w:t xml:space="preserve">Dysphagia, altered consciousness, impaired airway protection (stroke, seizure) </w:t>
+      </w:r>
+      <w:r>
+        <w:rPr>
+          <w:b w:val="0"/>
+          <w:i w:val="0"/>
+        </w:rPr>
+        <w:t>Slide 50</w:t>
+      </w:r>
+      <w:r>
+        <w:rPr>
+          <w:b w:val="0"/>
+          <w:i w:val="0"/>
+        </w:rPr>
+        <w:t>Pathology</w:t>
+      </w:r>
+      <w:r>
+        <w:rPr>
+          <w:b w:val="0"/>
+          <w:i w:val="0"/>
+        </w:rPr>
+        <w:t xml:space="preserve">Gravity-dependent airspace opacity in a lobar or segmental distribution </w:t>
+      </w:r>
+      <w:r>
+        <w:rPr>
+          <w:b w:val="0"/>
+          <w:i w:val="0"/>
+        </w:rPr>
+        <w:t>Slide 33</w:t>
+      </w:r>
+      <w:r>
+        <w:rPr>
+          <w:b w:val="0"/>
+          <w:i w:val="0"/>
+        </w:rPr>
+        <w:t>Clinical Manifestation</w:t>
+      </w:r>
+      <w:r>
+        <w:rPr>
+          <w:b w:val="0"/>
+          <w:i w:val="0"/>
+        </w:rPr>
+        <w:t xml:space="preserve">Pneumonitis: abrupt respiratory decline after a witnessed aspiration, fever or leukocytosis possible without infection. Pneumonia: infectious syndrome with an infiltrate; the event may be unwitnessed </w:t>
+      </w:r>
+      <w:r>
+        <w:rPr>
+          <w:b w:val="0"/>
+          <w:i w:val="0"/>
+        </w:rPr>
+        <w:t>Slide 51</w:t>
+      </w:r>
+      <w:r>
+        <w:rPr>
+          <w:b w:val="0"/>
+          <w:i w:val="0"/>
+        </w:rPr>
+        <w:t>Diagnosis</w:t>
+      </w:r>
+      <w:r>
+        <w:rPr>
+          <w:b w:val="0"/>
+          <w:i w:val="0"/>
+        </w:rPr>
+        <w:t xml:space="preserve">Chest film showing a gravity-dependent opacity; reassess persistence for secondary infection or complication </w:t>
+      </w:r>
+      <w:r>
+        <w:rPr>
+          <w:b w:val="0"/>
+          <w:i w:val="0"/>
+        </w:rPr>
+        <w:t>Slides 33, 51</w:t>
+      </w:r>
+      <w:r>
+        <w:rPr>
+          <w:b w:val="0"/>
+          <w:i w:val="0"/>
+        </w:rPr>
+        <w:t>Treatment/Therapy</w:t>
+      </w:r>
+      <w:r>
+        <w:rPr>
+          <w:b w:val="0"/>
+          <w:i w:val="0"/>
+        </w:rPr>
+        <w:t xml:space="preserve">Pneumonitis: support oxygenation and airway, no prophylactic antibiotics. Pneumonia: the community- or hospital-acquired pneumonia regimen by setting and severity; </w:t>
+      </w:r>
+      <w:r>
+        <w:rPr>
+          <w:b w:val="0"/>
+          <w:i w:val="0"/>
+          <w:highlight w:val="yellow"/>
+        </w:rPr>
+        <w:t>★ anaerobic coverage only for abscess or empyema</w:t>
+      </w:r>
+      <w:r>
+        <w:rPr>
+          <w:b w:val="0"/>
+          <w:i w:val="0"/>
+        </w:rPr>
+        <w:t xml:space="preserve">; assess swallowing, oral hygiene, positioning </w:t>
+      </w:r>
+      <w:r>
+        <w:rPr>
+          <w:b w:val="0"/>
+          <w:i w:val="0"/>
+        </w:rPr>
+        <w:t>Slides 50–51, 126</w:t>
+      </w:r>
+      <w:r>
+        <w:rPr>
+          <w:b w:val="0"/>
+          <w:i w:val="0"/>
+        </w:rPr>
+        <w:t>Mortality ★</w:t>
+      </w:r>
+      <w:r>
+        <w:rPr>
+          <w:b w:val="0"/>
+          <w:i w:val="0"/>
+        </w:rPr>
+        <w:t>Not covered in the lecture</w:t>
+      </w:r>
+    </w:p>
+    <w:p>
+      <w:pPr>
+        <w:spacing w:after="120"/>
+      </w:pPr>
+      <w:r>
+        <w:rPr>
+          <w:b w:val="0"/>
+          <w:i w:val="0"/>
+        </w:rPr>
+        <w:t>Lung abscess</w:t>
+      </w:r>
+      <w:r>
+        <w:rPr>
+          <w:b w:val="0"/>
+          <w:i w:val="0"/>
+        </w:rPr>
+        <w:t>2 not covered</w:t>
+      </w:r>
+      <w:r>
+        <w:br/>
+      </w:r>
+      <w:r>
+        <w:rPr>
+          <w:b w:val="0"/>
+          <w:i w:val="0"/>
+        </w:rPr>
+        <w:t>Name of Condition</w:t>
+      </w:r>
+      <w:r>
+        <w:rPr>
+          <w:b w:val="0"/>
+          <w:i w:val="0"/>
+        </w:rPr>
+        <w:t xml:space="preserve">Lung abscess </w:t>
+      </w:r>
+      <w:r>
+        <w:rPr>
+          <w:b w:val="0"/>
+          <w:i w:val="0"/>
+        </w:rPr>
+        <w:t>Slide 53</w:t>
+      </w:r>
+      <w:r>
+        <w:rPr>
+          <w:b w:val="0"/>
+          <w:i w:val="0"/>
+        </w:rPr>
+        <w:t>Definition</w:t>
+      </w:r>
+      <w:r>
+        <w:rPr>
+          <w:b w:val="0"/>
+          <w:i w:val="0"/>
+        </w:rPr>
+        <w:t xml:space="preserve">A cavitating lung infection, often after aspiration, that can become chronic </w:t>
+      </w:r>
+      <w:r>
+        <w:rPr>
+          <w:b w:val="0"/>
+          <w:i w:val="0"/>
+        </w:rPr>
+        <w:t>Slide 53</w:t>
+      </w:r>
+      <w:r>
+        <w:rPr>
+          <w:b w:val="0"/>
+          <w:i w:val="0"/>
+        </w:rPr>
+        <w:t>Etiology (cause)</w:t>
+      </w:r>
+      <w:r>
+        <w:rPr>
+          <w:b w:val="0"/>
+          <w:i w:val="0"/>
+        </w:rPr>
+        <w:t xml:space="preserve">Anaerobic oral flora, Mycobacterium tuberculosis, nontuberculous mycobacteria, Staphylococcus aureus including methicillin-resistant strains </w:t>
+      </w:r>
+      <w:r>
+        <w:rPr>
+          <w:b w:val="0"/>
+          <w:i w:val="0"/>
+        </w:rPr>
+        <w:t>Slide 41</w:t>
+      </w:r>
+      <w:r>
+        <w:rPr>
+          <w:b w:val="0"/>
+          <w:i w:val="0"/>
+        </w:rPr>
+        <w:t>Epidemiology (who)</w:t>
+      </w:r>
+      <w:r>
+        <w:rPr>
+          <w:b w:val="0"/>
+          <w:i w:val="0"/>
+        </w:rPr>
+        <w:t>Not covered in the lecture</w:t>
+      </w:r>
+      <w:r>
+        <w:rPr>
+          <w:b w:val="0"/>
+          <w:i w:val="0"/>
+        </w:rPr>
+        <w:t>Risk Factors</w:t>
+      </w:r>
+      <w:r>
+        <w:rPr>
+          <w:b w:val="0"/>
+          <w:i w:val="0"/>
+        </w:rPr>
+        <w:t xml:space="preserve">Aspiration </w:t>
+      </w:r>
+      <w:r>
+        <w:rPr>
+          <w:b w:val="0"/>
+          <w:i w:val="0"/>
+        </w:rPr>
+        <w:t>Slide 53</w:t>
+      </w:r>
+      <w:r>
+        <w:rPr>
+          <w:b w:val="0"/>
+          <w:i w:val="0"/>
+        </w:rPr>
+        <w:t>Pathology</w:t>
+      </w:r>
+      <w:r>
+        <w:rPr>
+          <w:b w:val="0"/>
+          <w:i w:val="0"/>
+        </w:rPr>
+        <w:t xml:space="preserve">Infection grows and cavitates, damaging tissue; cavity with an air-fluid level </w:t>
+      </w:r>
+      <w:r>
+        <w:rPr>
+          <w:b w:val="0"/>
+          <w:i w:val="0"/>
+        </w:rPr>
+        <w:t>Slides 53–54</w:t>
+      </w:r>
+      <w:r>
+        <w:rPr>
+          <w:b w:val="0"/>
+          <w:i w:val="0"/>
+        </w:rPr>
+        <w:t>Clinical Manifestation</w:t>
+      </w:r>
+      <w:r>
+        <w:rPr>
+          <w:b w:val="0"/>
+          <w:i w:val="0"/>
+        </w:rPr>
+        <w:t xml:space="preserve">Insidious, prolonged (weeks): fever, chills, sweats, cough, purulent foul-smelling sputum, hemoptysis, pleuritic pain, dyspnea, malaise; dullness, whispered pectoriloquy, bronchophony, amphoric breath sounds (like breathing across an open jar) </w:t>
+      </w:r>
+      <w:r>
+        <w:rPr>
+          <w:b w:val="0"/>
+          <w:i w:val="0"/>
+        </w:rPr>
+        <w:t>Slide 53</w:t>
+      </w:r>
+      <w:r>
+        <w:rPr>
+          <w:b w:val="0"/>
+          <w:i w:val="0"/>
+        </w:rPr>
+        <w:t>Diagnosis</w:t>
+      </w:r>
+      <w:r>
+        <w:rPr>
+          <w:b w:val="0"/>
+          <w:i w:val="0"/>
+          <w:highlight w:val="yellow"/>
+        </w:rPr>
+        <w:t>★ Cavitary lesion with an air-fluid level</w:t>
+      </w:r>
+      <w:r>
+        <w:rPr>
+          <w:b w:val="0"/>
+          <w:i w:val="0"/>
+        </w:rPr>
+        <w:t xml:space="preserve"> on chest film and computed tomography; bronchoscopy for obstruction, unusual pathogens or failure to improve </w:t>
+      </w:r>
+      <w:r>
+        <w:rPr>
+          <w:b w:val="0"/>
+          <w:i w:val="0"/>
+        </w:rPr>
+        <w:t>Slides 54, 56</w:t>
+      </w:r>
+      <w:r>
+        <w:rPr>
+          <w:b w:val="0"/>
+          <w:i w:val="0"/>
+        </w:rPr>
+        <w:t>Treatment/Therapy</w:t>
+      </w:r>
+      <w:r>
+        <w:rPr>
+          <w:b w:val="0"/>
+          <w:i w:val="0"/>
+        </w:rPr>
+        <w:t xml:space="preserve">Usually begins with antibiotics: intravenous ampicillin/sulbactam then oral amoxicillin/clavulanate, for several weeks; clindamycin reserved (C. difficile risk); pulmonary or infectious disease review for drainage or surgery if large or refractory; chest physiotherapy not essential </w:t>
+      </w:r>
+      <w:r>
+        <w:rPr>
+          <w:b w:val="0"/>
+          <w:i w:val="0"/>
+        </w:rPr>
+        <w:t>Slides 38, 56</w:t>
+      </w:r>
+      <w:r>
+        <w:rPr>
+          <w:b w:val="0"/>
+          <w:i w:val="0"/>
+        </w:rPr>
+        <w:t>Mortality ★</w:t>
+      </w:r>
+      <w:r>
+        <w:rPr>
+          <w:b w:val="0"/>
+          <w:i w:val="0"/>
+        </w:rPr>
+        <w:t>Not covered in the lecture</w:t>
+      </w:r>
+    </w:p>
+    <w:p>
+      <w:pPr>
+        <w:spacing w:after="120"/>
+      </w:pPr>
+      <w:r>
+        <w:rPr>
+          <w:b w:val="0"/>
+          <w:i w:val="0"/>
+        </w:rPr>
+        <w:t>Pneumocystis jirovecii pneumonia</w:t>
+      </w:r>
+      <w:r>
+        <w:rPr>
+          <w:b w:val="0"/>
+          <w:i w:val="0"/>
+        </w:rPr>
+        <w:t>★ Professor emphasized</w:t>
+      </w:r>
+    </w:p>
+    <w:p>
+      <w:pPr>
+        <w:spacing w:after="120"/>
+      </w:pPr>
+      <w:r>
+        <w:rPr>
+          <w:b w:val="0"/>
+          <w:i w:val="0"/>
+        </w:rPr>
+        <w:t>★ Know the presentation in HIV, the workup ladder (induced sputum, then lavage), TMP-SMX, the steroid trigger (arterial oxygen below 70) and the prophylaxis threshold.</w:t>
+      </w:r>
+    </w:p>
+    <w:p>
+      <w:pPr>
+        <w:spacing w:after="120"/>
+      </w:pPr>
+      <w:r>
+        <w:rPr>
+          <w:b w:val="0"/>
+          <w:i w:val="0"/>
+        </w:rPr>
+        <w:t>Name of Condition</w:t>
+      </w:r>
+      <w:r>
+        <w:rPr>
+          <w:b w:val="0"/>
+          <w:i w:val="0"/>
+        </w:rPr>
+        <w:t xml:space="preserve">Pneumocystis jirovecii pneumonia (PJP), formerly Pneumocystis carinii pneumonia (PCP) </w:t>
+      </w:r>
+      <w:r>
+        <w:rPr>
+          <w:b w:val="0"/>
+          <w:i w:val="0"/>
+        </w:rPr>
+        <w:t>Slide 58</w:t>
+      </w:r>
+      <w:r>
+        <w:rPr>
+          <w:b w:val="0"/>
+          <w:i w:val="0"/>
+        </w:rPr>
+        <w:t>Definition</w:t>
+      </w:r>
+      <w:r>
+        <w:rPr>
+          <w:b w:val="0"/>
+          <w:i w:val="0"/>
+        </w:rPr>
+        <w:t xml:space="preserve">A fungal pneumonia, the most common opportunistic infection in people with HIV (human immunodeficiency virus); treated primarily with antibiotics </w:t>
+      </w:r>
+      <w:r>
+        <w:rPr>
+          <w:b w:val="0"/>
+          <w:i w:val="0"/>
+        </w:rPr>
+        <w:t>Slide 58</w:t>
+      </w:r>
+      <w:r>
+        <w:rPr>
+          <w:b w:val="0"/>
+          <w:i w:val="0"/>
+        </w:rPr>
+        <w:t>Etiology (cause)</w:t>
+      </w:r>
+      <w:r>
+        <w:rPr>
+          <w:b w:val="0"/>
+          <w:i w:val="0"/>
+        </w:rPr>
+        <w:t xml:space="preserve">Pneumocystis jirovecii </w:t>
+      </w:r>
+      <w:r>
+        <w:rPr>
+          <w:b w:val="0"/>
+          <w:i w:val="0"/>
+        </w:rPr>
+        <w:t>Slide 58</w:t>
+      </w:r>
+      <w:r>
+        <w:rPr>
+          <w:b w:val="0"/>
+          <w:i w:val="0"/>
+        </w:rPr>
+        <w:t>Epidemiology (who)</w:t>
+      </w:r>
+      <w:r>
+        <w:rPr>
+          <w:b w:val="0"/>
+          <w:i w:val="0"/>
+        </w:rPr>
+        <w:t xml:space="preserve">Falling with prophylaxis and antiretroviral therapy; mortality 10 to 20%; still a major cause of death in acquired immunodeficiency syndrome in the United States </w:t>
+      </w:r>
+      <w:r>
+        <w:rPr>
+          <w:b w:val="0"/>
+          <w:i w:val="0"/>
+        </w:rPr>
+        <w:t>Slides 59–60</w:t>
+      </w:r>
+      <w:r>
+        <w:rPr>
+          <w:b w:val="0"/>
+          <w:i w:val="0"/>
+        </w:rPr>
+        <w:t>Risk Factors</w:t>
+      </w:r>
+      <w:r>
+        <w:rPr>
+          <w:b w:val="0"/>
+          <w:i w:val="0"/>
+        </w:rPr>
+        <w:t xml:space="preserve">HIV (human immunodeficiency virus); chemotherapy, anti-rejection drugs, long-term steroids, organ transplant, blood cancer </w:t>
+      </w:r>
+      <w:r>
+        <w:rPr>
+          <w:b w:val="0"/>
+          <w:i w:val="0"/>
+        </w:rPr>
+        <w:t>Slide 61</w:t>
+      </w:r>
+      <w:r>
+        <w:rPr>
+          <w:b w:val="0"/>
+          <w:i w:val="0"/>
+        </w:rPr>
+        <w:t>Pathology</w:t>
+      </w:r>
+      <w:r>
+        <w:rPr>
+          <w:b w:val="0"/>
+          <w:i w:val="0"/>
+        </w:rPr>
+        <w:t xml:space="preserve">Interstitial pneumonia </w:t>
+      </w:r>
+      <w:r>
+        <w:rPr>
+          <w:b w:val="0"/>
+          <w:i w:val="0"/>
+        </w:rPr>
+        <w:t>Slides 33, 70</w:t>
+      </w:r>
+      <w:r>
+        <w:rPr>
+          <w:b w:val="0"/>
+          <w:i w:val="0"/>
+        </w:rPr>
+        <w:t>Clinical Manifestation</w:t>
+      </w:r>
+      <w:r>
+        <w:rPr>
+          <w:b w:val="0"/>
+          <w:i w:val="0"/>
+          <w:highlight w:val="yellow"/>
+        </w:rPr>
+        <w:t>★ Progressive exertional dyspnea (95%) and nonproductive cough (95%)</w:t>
+      </w:r>
+      <w:r>
+        <w:rPr>
+          <w:b w:val="0"/>
+          <w:i w:val="0"/>
+        </w:rPr>
+        <w:t xml:space="preserve">, fever (over 80%), chest discomfort, weight loss, chills; tachypnea, tachycardia, mild crackles, but up to half have a normal exam </w:t>
+      </w:r>
+      <w:r>
+        <w:rPr>
+          <w:b w:val="0"/>
+          <w:i w:val="0"/>
+        </w:rPr>
+        <w:t>Slides 62–63</w:t>
+      </w:r>
+      <w:r>
+        <w:rPr>
+          <w:b w:val="0"/>
+          <w:i w:val="0"/>
+        </w:rPr>
+        <w:t>Diagnosis</w:t>
+      </w:r>
+      <w:r>
+        <w:rPr>
+          <w:b w:val="0"/>
+          <w:i w:val="0"/>
+        </w:rPr>
+        <w:t xml:space="preserve">Induced sputum or bronchoalveolar lavage microscopy or polymerase chain reaction (a negative induced sputum does not exclude; go to lavage); beta-D-glucan supports but is not specific; lactate dehydrogenase nonspecific; HIV (human immunodeficiency virus) test, CD4 (cluster of differentiation 4) count and viral load; film: diffuse bilateral perihilar infiltrates; start therapy while confirming if suspicion is high </w:t>
+      </w:r>
+      <w:r>
+        <w:rPr>
+          <w:b w:val="0"/>
+          <w:i w:val="0"/>
+        </w:rPr>
+        <w:t>Slides 65–70</w:t>
+      </w:r>
+      <w:r>
+        <w:rPr>
+          <w:b w:val="0"/>
+          <w:i w:val="0"/>
+        </w:rPr>
+        <w:t>Treatment/Therapy</w:t>
+      </w:r>
+      <w:r>
+        <w:rPr>
+          <w:b w:val="0"/>
+          <w:i w:val="0"/>
+          <w:highlight w:val="yellow"/>
+        </w:rPr>
+        <w:t>★ Trimethoprim-sulfamethoxazole preferred</w:t>
+      </w:r>
+      <w:r>
+        <w:rPr>
+          <w:b w:val="0"/>
+          <w:i w:val="0"/>
+        </w:rPr>
+        <w:t xml:space="preserve"> (21 days in HIV); alternatives clindamycin plus primaquine, intravenous pentamidine, atovaquone (mild); check G6PD (glucose-6-phosphate dehydrogenase) before primaquine or dapsone; </w:t>
+      </w:r>
+      <w:r>
+        <w:rPr>
+          <w:b w:val="0"/>
+          <w:i w:val="0"/>
+          <w:highlight w:val="yellow"/>
+        </w:rPr>
+        <w:t>★ steroids if room-air arterial oxygen below 70 mm Hg</w:t>
+      </w:r>
+      <w:r>
+        <w:rPr>
+          <w:b w:val="0"/>
+          <w:i w:val="0"/>
+        </w:rPr>
+        <w:t xml:space="preserve">; prophylaxis for CD4 below 100 (or 100 to 200 with detectable HIV (human immunodeficiency virus) RNA); antiretroviral therapy within about 2 weeks </w:t>
+      </w:r>
+      <w:r>
+        <w:rPr>
+          <w:b w:val="0"/>
+          <w:i w:val="0"/>
+        </w:rPr>
+        <w:t>Slides 71–73</w:t>
+      </w:r>
+      <w:r>
+        <w:rPr>
+          <w:b w:val="0"/>
+          <w:i w:val="0"/>
+        </w:rPr>
+        <w:t>Mortality ★</w:t>
+      </w:r>
+      <w:r>
+        <w:rPr>
+          <w:b w:val="0"/>
+          <w:i w:val="0"/>
+        </w:rPr>
+        <w:t xml:space="preserve">10 to 20% </w:t>
+      </w:r>
+      <w:r>
+        <w:rPr>
+          <w:b w:val="0"/>
+          <w:i w:val="0"/>
+        </w:rPr>
+        <w:t>Slide 60</w:t>
+      </w:r>
+    </w:p>
+    <w:p>
+      <w:pPr>
+        <w:spacing w:after="120"/>
+      </w:pPr>
+      <w:r>
+        <w:rPr>
+          <w:b w:val="0"/>
+          <w:i w:val="0"/>
+        </w:rPr>
+        <w:t>Histoplasmosis</w:t>
+      </w:r>
+      <w:r>
+        <w:rPr>
+          <w:b w:val="0"/>
+          <w:i w:val="0"/>
+        </w:rPr>
+        <w:t>★ Professor emphasized</w:t>
+      </w:r>
+      <w:r>
+        <w:rPr>
+          <w:b w:val="0"/>
+          <w:i w:val="0"/>
+        </w:rPr>
+        <w:t>1 not covered</w:t>
+      </w:r>
+    </w:p>
+    <w:p>
+      <w:pPr>
+        <w:spacing w:after="120"/>
+      </w:pPr>
+      <w:r>
+        <w:rPr>
+          <w:b w:val="0"/>
+          <w:i w:val="0"/>
+        </w:rPr>
+        <w:t>★ He said it is 'going to show up on your PANCE'.</w:t>
+      </w:r>
+    </w:p>
+    <w:p>
+      <w:pPr>
+        <w:spacing w:after="120"/>
+      </w:pPr>
+      <w:r>
+        <w:rPr>
+          <w:b w:val="0"/>
+          <w:i w:val="0"/>
+        </w:rPr>
+        <w:t>Name of Condition</w:t>
+      </w:r>
+      <w:r>
+        <w:rPr>
+          <w:b w:val="0"/>
+          <w:i w:val="0"/>
+        </w:rPr>
+        <w:t xml:space="preserve">Histoplasmosis </w:t>
+      </w:r>
+      <w:r>
+        <w:rPr>
+          <w:b w:val="0"/>
+          <w:i w:val="0"/>
+        </w:rPr>
+        <w:t>Slide 75</w:t>
+      </w:r>
+      <w:r>
+        <w:rPr>
+          <w:b w:val="0"/>
+          <w:i w:val="0"/>
+        </w:rPr>
+        <w:t>Definition</w:t>
+      </w:r>
+      <w:r>
+        <w:rPr>
+          <w:b w:val="0"/>
+          <w:i w:val="0"/>
+        </w:rPr>
+        <w:t xml:space="preserve">Infection by the fungus Histoplasma capsulatum </w:t>
+      </w:r>
+      <w:r>
+        <w:rPr>
+          <w:b w:val="0"/>
+          <w:i w:val="0"/>
+        </w:rPr>
+        <w:t>Slide 75</w:t>
+      </w:r>
+      <w:r>
+        <w:rPr>
+          <w:b w:val="0"/>
+          <w:i w:val="0"/>
+        </w:rPr>
+        <w:t>Etiology (cause)</w:t>
+      </w:r>
+      <w:r>
+        <w:rPr>
+          <w:b w:val="0"/>
+          <w:i w:val="0"/>
+        </w:rPr>
+        <w:t xml:space="preserve">Inhaled from soil and bird or bat droppings (farming, gardening, chicken coops) </w:t>
+      </w:r>
+      <w:r>
+        <w:rPr>
+          <w:b w:val="0"/>
+          <w:i w:val="0"/>
+        </w:rPr>
+        <w:t>Slide 75</w:t>
+      </w:r>
+      <w:r>
+        <w:rPr>
+          <w:b w:val="0"/>
+          <w:i w:val="0"/>
+        </w:rPr>
+        <w:t>Epidemiology (who)</w:t>
+      </w:r>
+      <w:r>
+        <w:rPr>
+          <w:b w:val="0"/>
+          <w:i w:val="0"/>
+        </w:rPr>
+        <w:t xml:space="preserve">United States: mainly central and eastern states, especially the Ohio and Mississippi River valleys; rare </w:t>
+      </w:r>
+      <w:r>
+        <w:rPr>
+          <w:b w:val="0"/>
+          <w:i w:val="0"/>
+        </w:rPr>
+        <w:t>Slide 75</w:t>
+      </w:r>
+      <w:r>
+        <w:rPr>
+          <w:b w:val="0"/>
+          <w:i w:val="0"/>
+        </w:rPr>
+        <w:t>Risk Factors</w:t>
+      </w:r>
+      <w:r>
+        <w:rPr>
+          <w:b w:val="0"/>
+          <w:i w:val="0"/>
+        </w:rPr>
+        <w:t xml:space="preserve">Soil disruption, bird or bat droppings; late HIV </w:t>
+      </w:r>
+      <w:r>
+        <w:rPr>
+          <w:b w:val="0"/>
+          <w:i w:val="0"/>
+        </w:rPr>
+        <w:t>Slides 41, 75</w:t>
+      </w:r>
+      <w:r>
+        <w:rPr>
+          <w:b w:val="0"/>
+          <w:i w:val="0"/>
+        </w:rPr>
+        <w:t>Pathology</w:t>
+      </w:r>
+      <w:r>
+        <w:rPr>
+          <w:b w:val="0"/>
+          <w:i w:val="0"/>
+        </w:rPr>
+        <w:t xml:space="preserve">Granuloma (some patients show only a granuloma on film) </w:t>
+      </w:r>
+      <w:r>
+        <w:rPr>
+          <w:b w:val="0"/>
+          <w:i w:val="0"/>
+        </w:rPr>
+        <w:t>Slide 76</w:t>
+      </w:r>
+      <w:r>
+        <w:rPr>
+          <w:b w:val="0"/>
+          <w:i w:val="0"/>
+        </w:rPr>
+        <w:t>Clinical Manifestation</w:t>
+      </w:r>
+      <w:r>
+        <w:rPr>
+          <w:b w:val="0"/>
+          <w:i w:val="0"/>
+        </w:rPr>
+        <w:t xml:space="preserve">High fever, chills, myalgias, nonproductive cough, chest pain, headache 3 to 17 days after exposure; some asymptomatic </w:t>
+      </w:r>
+      <w:r>
+        <w:rPr>
+          <w:b w:val="0"/>
+          <w:i w:val="0"/>
+        </w:rPr>
+        <w:t>Slide 76</w:t>
+      </w:r>
+      <w:r>
+        <w:rPr>
+          <w:b w:val="0"/>
+          <w:i w:val="0"/>
+        </w:rPr>
+        <w:t>Diagnosis</w:t>
+      </w:r>
+      <w:r>
+        <w:rPr>
+          <w:b w:val="0"/>
+          <w:i w:val="0"/>
+        </w:rPr>
+        <w:t xml:space="preserve">Ask about geography, soil and droppings; </w:t>
+      </w:r>
+      <w:r>
+        <w:rPr>
+          <w:b w:val="0"/>
+          <w:i w:val="0"/>
+          <w:highlight w:val="yellow"/>
+        </w:rPr>
+        <w:t>★ urine Histoplasma antigen</w:t>
+      </w:r>
+      <w:r>
+        <w:rPr>
+          <w:b w:val="0"/>
+          <w:i w:val="0"/>
+        </w:rPr>
+        <w:t xml:space="preserve">, often with serum antigen and antibody; early negative tests do not exclude; cross-reacts with Blastomyces; culture or histopathology for severe or uncertain cases </w:t>
+      </w:r>
+      <w:r>
+        <w:rPr>
+          <w:b w:val="0"/>
+          <w:i w:val="0"/>
+        </w:rPr>
+        <w:t>Slide 77</w:t>
+      </w:r>
+      <w:r>
+        <w:rPr>
+          <w:b w:val="0"/>
+          <w:i w:val="0"/>
+        </w:rPr>
+        <w:t>Treatment/Therapy</w:t>
+      </w:r>
+      <w:r>
+        <w:rPr>
+          <w:b w:val="0"/>
+          <w:i w:val="0"/>
+        </w:rPr>
+        <w:t xml:space="preserve">Mild acute disease in an immunocompetent adult: often observation; itraconazole for prolonged or progressive illness or higher-risk hosts; specialist-led amphotericin induction for severe or disseminated disease; chronic cavitary disease: azole for at least 12 months </w:t>
+      </w:r>
+      <w:r>
+        <w:rPr>
+          <w:b w:val="0"/>
+          <w:i w:val="0"/>
+        </w:rPr>
+        <w:t>Slide 78</w:t>
+      </w:r>
+      <w:r>
+        <w:rPr>
+          <w:b w:val="0"/>
+          <w:i w:val="0"/>
+        </w:rPr>
+        <w:t>Mortality ★</w:t>
+      </w:r>
+      <w:r>
+        <w:rPr>
+          <w:b w:val="0"/>
+          <w:i w:val="0"/>
+        </w:rPr>
+        <w:t>Not covered in the lecture</w:t>
+      </w:r>
+    </w:p>
+    <w:p>
+      <w:pPr>
+        <w:spacing w:after="120"/>
+      </w:pPr>
+      <w:r>
+        <w:rPr>
+          <w:b w:val="0"/>
+          <w:i w:val="0"/>
+        </w:rPr>
+        <w:t>Cryptococcosis</w:t>
+      </w:r>
+      <w:r>
+        <w:rPr>
+          <w:b w:val="0"/>
+          <w:i w:val="0"/>
+        </w:rPr>
+        <w:t>1 not covered</w:t>
+      </w:r>
+      <w:r>
+        <w:br/>
+      </w:r>
+      <w:r>
+        <w:rPr>
+          <w:b w:val="0"/>
+          <w:i w:val="0"/>
+        </w:rPr>
+        <w:t>Name of Condition</w:t>
+      </w:r>
+      <w:r>
+        <w:rPr>
+          <w:b w:val="0"/>
+          <w:i w:val="0"/>
+        </w:rPr>
+        <w:t xml:space="preserve">Cryptococcosis </w:t>
+      </w:r>
+      <w:r>
+        <w:rPr>
+          <w:b w:val="0"/>
+          <w:i w:val="0"/>
+        </w:rPr>
+        <w:t>Slide 123</w:t>
+      </w:r>
+      <w:r>
+        <w:rPr>
+          <w:b w:val="0"/>
+          <w:i w:val="0"/>
+        </w:rPr>
+        <w:t>Definition</w:t>
+      </w:r>
+      <w:r>
+        <w:rPr>
+          <w:b w:val="0"/>
+          <w:i w:val="0"/>
+        </w:rPr>
+        <w:t xml:space="preserve">Infection by Cryptococcus neoformans or C. gattii after environmental inhalation </w:t>
+      </w:r>
+      <w:r>
+        <w:rPr>
+          <w:b w:val="0"/>
+          <w:i w:val="0"/>
+        </w:rPr>
+        <w:t>Slide 123</w:t>
+      </w:r>
+      <w:r>
+        <w:rPr>
+          <w:b w:val="0"/>
+          <w:i w:val="0"/>
+        </w:rPr>
+        <w:t>Etiology (cause)</w:t>
+      </w:r>
+      <w:r>
+        <w:rPr>
+          <w:b w:val="0"/>
+          <w:i w:val="0"/>
+        </w:rPr>
+        <w:t xml:space="preserve">Cryptococcus neoformans, C. gattii </w:t>
+      </w:r>
+      <w:r>
+        <w:rPr>
+          <w:b w:val="0"/>
+          <w:i w:val="0"/>
+        </w:rPr>
+        <w:t>Slide 123</w:t>
+      </w:r>
+      <w:r>
+        <w:rPr>
+          <w:b w:val="0"/>
+          <w:i w:val="0"/>
+        </w:rPr>
+        <w:t>Epidemiology (who)</w:t>
+      </w:r>
+      <w:r>
+        <w:rPr>
+          <w:b w:val="0"/>
+          <w:i w:val="0"/>
+        </w:rPr>
+        <w:t xml:space="preserve">Also occurs without immunocompromise </w:t>
+      </w:r>
+      <w:r>
+        <w:rPr>
+          <w:b w:val="0"/>
+          <w:i w:val="0"/>
+        </w:rPr>
+        <w:t>Slide 123</w:t>
+      </w:r>
+      <w:r>
+        <w:rPr>
+          <w:b w:val="0"/>
+          <w:i w:val="0"/>
+        </w:rPr>
+        <w:t>Risk Factors</w:t>
+      </w:r>
+      <w:r>
+        <w:rPr>
+          <w:b w:val="0"/>
+          <w:i w:val="0"/>
+        </w:rPr>
+        <w:t xml:space="preserve">HIV, transplant, steroids </w:t>
+      </w:r>
+      <w:r>
+        <w:rPr>
+          <w:b w:val="0"/>
+          <w:i w:val="0"/>
+        </w:rPr>
+        <w:t>Slide 123</w:t>
+      </w:r>
+      <w:r>
+        <w:rPr>
+          <w:b w:val="0"/>
+          <w:i w:val="0"/>
+        </w:rPr>
+        <w:t>Pathology</w:t>
+      </w:r>
+      <w:r>
+        <w:rPr>
+          <w:b w:val="0"/>
+          <w:i w:val="0"/>
+        </w:rPr>
+        <w:t xml:space="preserve">Nodules or consolidation </w:t>
+      </w:r>
+      <w:r>
+        <w:rPr>
+          <w:b w:val="0"/>
+          <w:i w:val="0"/>
+        </w:rPr>
+        <w:t>Slide 123</w:t>
+      </w:r>
+      <w:r>
+        <w:rPr>
+          <w:b w:val="0"/>
+          <w:i w:val="0"/>
+        </w:rPr>
+        <w:t>Clinical Manifestation</w:t>
+      </w:r>
+      <w:r>
+        <w:rPr>
+          <w:b w:val="0"/>
+          <w:i w:val="0"/>
+        </w:rPr>
+        <w:t xml:space="preserve">Cough, fever; can mimic community-acquired pneumonia, tuberculosis or cancer; headache or confusion suggests central nervous system involvement </w:t>
+      </w:r>
+      <w:r>
+        <w:rPr>
+          <w:b w:val="0"/>
+          <w:i w:val="0"/>
+        </w:rPr>
+        <w:t>Slide 123</w:t>
+      </w:r>
+      <w:r>
+        <w:rPr>
+          <w:b w:val="0"/>
+          <w:i w:val="0"/>
+        </w:rPr>
+        <w:t>Diagnosis</w:t>
+      </w:r>
+      <w:r>
+        <w:rPr>
+          <w:b w:val="0"/>
+          <w:i w:val="0"/>
+        </w:rPr>
+        <w:t xml:space="preserve">Serum cryptococcal antigen, respiratory culture or histology; evaluate for central nervous system or disseminated disease, often with a lumbar puncture </w:t>
+      </w:r>
+      <w:r>
+        <w:rPr>
+          <w:b w:val="0"/>
+          <w:i w:val="0"/>
+        </w:rPr>
+        <w:t>Slide 123</w:t>
+      </w:r>
+      <w:r>
+        <w:rPr>
+          <w:b w:val="0"/>
+          <w:i w:val="0"/>
+        </w:rPr>
+        <w:t>Treatment/Therapy</w:t>
+      </w:r>
+      <w:r>
+        <w:rPr>
+          <w:b w:val="0"/>
+          <w:i w:val="0"/>
+        </w:rPr>
+        <w:t xml:space="preserve">Mild isolated pulmonary: fluconazole, generally 6 to 12 months. Severe, central nervous system or disseminated: liposomal amphotericin B plus flucytosine induction, then fluconazole; infectious disease consultation; monitor toxicity; counsel adherence </w:t>
+      </w:r>
+      <w:r>
+        <w:rPr>
+          <w:b w:val="0"/>
+          <w:i w:val="0"/>
+        </w:rPr>
+        <w:t>Slide 123</w:t>
+      </w:r>
+      <w:r>
+        <w:rPr>
+          <w:b w:val="0"/>
+          <w:i w:val="0"/>
+        </w:rPr>
+        <w:t>Mortality ★</w:t>
+      </w:r>
+      <w:r>
+        <w:rPr>
+          <w:b w:val="0"/>
+          <w:i w:val="0"/>
+        </w:rPr>
+        <w:t>Not covered in the lecture</w:t>
+      </w:r>
+    </w:p>
+    <w:p>
+      <w:pPr>
+        <w:spacing w:after="120"/>
+      </w:pPr>
+      <w:r>
+        <w:rPr>
+          <w:b w:val="0"/>
+          <w:i w:val="0"/>
+        </w:rPr>
+        <w:t>Psittacosis</w:t>
+      </w:r>
+      <w:r>
+        <w:rPr>
+          <w:b w:val="0"/>
+          <w:i w:val="0"/>
+        </w:rPr>
+        <w:t>★ Professor emphasized</w:t>
+      </w:r>
+      <w:r>
+        <w:rPr>
+          <w:b w:val="0"/>
+          <w:i w:val="0"/>
+        </w:rPr>
+        <w:t>1 not covered</w:t>
+      </w:r>
+    </w:p>
+    <w:p>
+      <w:pPr>
+        <w:spacing w:after="120"/>
+      </w:pPr>
+      <w:r>
+        <w:rPr>
+          <w:b w:val="0"/>
+          <w:i w:val="0"/>
+        </w:rPr>
+        <w:t>★ 'A super common medical boards question', though not common enough to deserve a lot of attention.</w:t>
+      </w:r>
+    </w:p>
+    <w:p>
+      <w:pPr>
+        <w:spacing w:after="120"/>
+      </w:pPr>
+      <w:r>
+        <w:rPr>
+          <w:b w:val="0"/>
+          <w:i w:val="0"/>
+        </w:rPr>
+        <w:t>Name of Condition</w:t>
+      </w:r>
+      <w:r>
+        <w:rPr>
+          <w:b w:val="0"/>
+          <w:i w:val="0"/>
+        </w:rPr>
+        <w:t xml:space="preserve">Psittacosis (parrot fever) </w:t>
+      </w:r>
+      <w:r>
+        <w:rPr>
+          <w:b w:val="0"/>
+          <w:i w:val="0"/>
+        </w:rPr>
+        <w:t>Slide 80</w:t>
+      </w:r>
+      <w:r>
+        <w:rPr>
+          <w:b w:val="0"/>
+          <w:i w:val="0"/>
+        </w:rPr>
+        <w:t>Definition</w:t>
+      </w:r>
+      <w:r>
+        <w:rPr>
+          <w:b w:val="0"/>
+          <w:i w:val="0"/>
+        </w:rPr>
+        <w:t xml:space="preserve">Infection by the obligate intracellular bacterium Chlamydia psittaci </w:t>
+      </w:r>
+      <w:r>
+        <w:rPr>
+          <w:b w:val="0"/>
+          <w:i w:val="0"/>
+        </w:rPr>
+        <w:t>Slide 80</w:t>
+      </w:r>
+      <w:r>
+        <w:rPr>
+          <w:b w:val="0"/>
+          <w:i w:val="0"/>
+        </w:rPr>
+        <w:t>Etiology (cause)</w:t>
+      </w:r>
+      <w:r>
+        <w:rPr>
+          <w:b w:val="0"/>
+          <w:i w:val="0"/>
+        </w:rPr>
+        <w:t xml:space="preserve">Chlamydia psittaci from parrots, parakeets, canaries and other birds </w:t>
+      </w:r>
+      <w:r>
+        <w:rPr>
+          <w:b w:val="0"/>
+          <w:i w:val="0"/>
+        </w:rPr>
+        <w:t>Slides 80–81</w:t>
+      </w:r>
+      <w:r>
+        <w:rPr>
+          <w:b w:val="0"/>
+          <w:i w:val="0"/>
+        </w:rPr>
+        <w:t>Epidemiology (who)</w:t>
+      </w:r>
+      <w:r>
+        <w:rPr>
+          <w:b w:val="0"/>
+          <w:i w:val="0"/>
+        </w:rPr>
+        <w:t xml:space="preserve">Rare, about 200 patients a year; an occupational disease (zoo and pet-shop workers, poultry farmers, ranchers) </w:t>
+      </w:r>
+      <w:r>
+        <w:rPr>
+          <w:b w:val="0"/>
+          <w:i w:val="0"/>
+        </w:rPr>
+        <w:t>Slides 80–81</w:t>
+      </w:r>
+      <w:r>
+        <w:rPr>
+          <w:b w:val="0"/>
+          <w:i w:val="0"/>
+        </w:rPr>
+        <w:t>Risk Factors</w:t>
+      </w:r>
+      <w:r>
+        <w:rPr>
+          <w:b w:val="0"/>
+          <w:i w:val="0"/>
+        </w:rPr>
+        <w:t xml:space="preserve">Handling sick birds, mouth-to-beak resuscitation; human-to-human spread rare </w:t>
+      </w:r>
+      <w:r>
+        <w:rPr>
+          <w:b w:val="0"/>
+          <w:i w:val="0"/>
+        </w:rPr>
+        <w:t>Slide 81</w:t>
+      </w:r>
+      <w:r>
+        <w:rPr>
+          <w:b w:val="0"/>
+          <w:i w:val="0"/>
+        </w:rPr>
+        <w:t>Pathology</w:t>
+      </w:r>
+      <w:r>
+        <w:rPr>
+          <w:b w:val="0"/>
+          <w:i w:val="0"/>
+        </w:rPr>
+        <w:t xml:space="preserve">Stages: flulike illness with a normal film, mild to moderate pneumonia, severe pneumonia, respiratory failure and septic shock </w:t>
+      </w:r>
+      <w:r>
+        <w:rPr>
+          <w:b w:val="0"/>
+          <w:i w:val="0"/>
+        </w:rPr>
+        <w:t>Slide 84</w:t>
+      </w:r>
+      <w:r>
+        <w:rPr>
+          <w:b w:val="0"/>
+          <w:i w:val="0"/>
+        </w:rPr>
+        <w:t>Clinical Manifestation</w:t>
+      </w:r>
+      <w:r>
+        <w:rPr>
+          <w:b w:val="0"/>
+          <w:i w:val="0"/>
+        </w:rPr>
+        <w:t xml:space="preserve">Fever and cough (50 to 90%, cough usually dry), chills, malaise, dyspnea, sore throat, epistaxis, severe headache, photophobia; </w:t>
+      </w:r>
+      <w:r>
+        <w:rPr>
+          <w:b w:val="0"/>
+          <w:i w:val="0"/>
+          <w:highlight w:val="yellow"/>
+        </w:rPr>
+        <w:t>★ relative bradycardia</w:t>
+      </w:r>
+      <w:r>
+        <w:rPr>
+          <w:b w:val="0"/>
+          <w:i w:val="0"/>
+        </w:rPr>
+        <w:t xml:space="preserve">, splenomegaly, Horder spots (rose-spot-like macules on the face), hemolytic anemia </w:t>
+      </w:r>
+      <w:r>
+        <w:rPr>
+          <w:b w:val="0"/>
+          <w:i w:val="0"/>
+        </w:rPr>
+        <w:t>Slides 82–83</w:t>
+      </w:r>
+      <w:r>
+        <w:rPr>
+          <w:b w:val="0"/>
+          <w:i w:val="0"/>
+        </w:rPr>
+        <w:t>Diagnosis</w:t>
+      </w:r>
+      <w:r>
+        <w:rPr>
+          <w:b w:val="0"/>
+          <w:i w:val="0"/>
+        </w:rPr>
+        <w:t xml:space="preserve">Ask about bird exposure; </w:t>
+      </w:r>
+      <w:r>
+        <w:rPr>
+          <w:b w:val="0"/>
+          <w:i w:val="0"/>
+          <w:highlight w:val="yellow"/>
+        </w:rPr>
+        <w:t>★ respiratory nucleic acid amplification test or polymerase chain reaction</w:t>
+      </w:r>
+      <w:r>
+        <w:rPr>
+          <w:b w:val="0"/>
+          <w:i w:val="0"/>
+        </w:rPr>
+        <w:t xml:space="preserve">; paired serology cross-reacts; routine culture does not detect it; film: unilateral lower-lobe dense infiltrate, resolving in about 6 weeks </w:t>
+      </w:r>
+      <w:r>
+        <w:rPr>
+          <w:b w:val="0"/>
+          <w:i w:val="0"/>
+        </w:rPr>
+        <w:t>Slides 85–86</w:t>
+      </w:r>
+      <w:r>
+        <w:rPr>
+          <w:b w:val="0"/>
+          <w:i w:val="0"/>
+        </w:rPr>
+        <w:t>Treatment/Therapy</w:t>
+      </w:r>
+      <w:r>
+        <w:rPr>
+          <w:b w:val="0"/>
+          <w:i w:val="0"/>
+          <w:highlight w:val="yellow"/>
+        </w:rPr>
+        <w:t>★ Doxycycline</w:t>
+      </w:r>
+      <w:r>
+        <w:rPr>
+          <w:b w:val="0"/>
+          <w:i w:val="0"/>
+        </w:rPr>
+        <w:t xml:space="preserve">, promptly, 10 to 14 days after fever resolves; macrolide with infectious disease input if tetracyclines are unsuitable; standard precautions; report to public health; veterinary assessment of birds </w:t>
+      </w:r>
+      <w:r>
+        <w:rPr>
+          <w:b w:val="0"/>
+          <w:i w:val="0"/>
+        </w:rPr>
+        <w:t>Slides 87–88</w:t>
+      </w:r>
+      <w:r>
+        <w:rPr>
+          <w:b w:val="0"/>
+          <w:i w:val="0"/>
+        </w:rPr>
+        <w:t>Mortality ★</w:t>
+      </w:r>
+      <w:r>
+        <w:rPr>
+          <w:b w:val="0"/>
+          <w:i w:val="0"/>
+        </w:rPr>
+        <w:t>Not covered in the lecture</w:t>
+      </w:r>
+    </w:p>
+    <w:p>
+      <w:pPr>
+        <w:spacing w:after="120"/>
+      </w:pPr>
+      <w:r>
+        <w:rPr>
+          <w:b w:val="0"/>
+          <w:i w:val="0"/>
+        </w:rPr>
+        <w:t>Mycoplasma pneumoniae pneumonia</w:t>
+      </w:r>
+      <w:r>
+        <w:rPr>
+          <w:b w:val="0"/>
+          <w:i w:val="0"/>
+        </w:rPr>
+        <w:t>2 not covered</w:t>
+      </w:r>
+      <w:r>
+        <w:br/>
+      </w:r>
+      <w:r>
+        <w:rPr>
+          <w:b w:val="0"/>
+          <w:i w:val="0"/>
+        </w:rPr>
+        <w:t>Name of Condition</w:t>
+      </w:r>
+      <w:r>
+        <w:rPr>
+          <w:b w:val="0"/>
+          <w:i w:val="0"/>
+        </w:rPr>
+        <w:t xml:space="preserve">Mycoplasma pneumoniae pneumonia </w:t>
+      </w:r>
+      <w:r>
+        <w:rPr>
+          <w:b w:val="0"/>
+          <w:i w:val="0"/>
+        </w:rPr>
+        <w:t>Slide 89</w:t>
+      </w:r>
+      <w:r>
+        <w:rPr>
+          <w:b w:val="0"/>
+          <w:i w:val="0"/>
+        </w:rPr>
+        <w:t>Definition</w:t>
+      </w:r>
+      <w:r>
+        <w:rPr>
+          <w:b w:val="0"/>
+          <w:i w:val="0"/>
+        </w:rPr>
+        <w:t xml:space="preserve">An atypical pneumonia caused by Mycoplasma pneumoniae, an organism that lacks a cell wall </w:t>
+      </w:r>
+      <w:r>
+        <w:rPr>
+          <w:b w:val="0"/>
+          <w:i w:val="0"/>
+        </w:rPr>
+        <w:t>Slide 89</w:t>
+      </w:r>
+      <w:r>
+        <w:rPr>
+          <w:b w:val="0"/>
+          <w:i w:val="0"/>
+        </w:rPr>
+        <w:t>Etiology (cause)</w:t>
+      </w:r>
+      <w:r>
+        <w:rPr>
+          <w:b w:val="0"/>
+          <w:i w:val="0"/>
+        </w:rPr>
+        <w:t xml:space="preserve">Mycoplasma pneumoniae </w:t>
+      </w:r>
+      <w:r>
+        <w:rPr>
+          <w:b w:val="0"/>
+          <w:i w:val="0"/>
+        </w:rPr>
+        <w:t>Slide 89</w:t>
+      </w:r>
+      <w:r>
+        <w:rPr>
+          <w:b w:val="0"/>
+          <w:i w:val="0"/>
+        </w:rPr>
+        <w:t>Epidemiology (who)</w:t>
+      </w:r>
+      <w:r>
+        <w:rPr>
+          <w:b w:val="0"/>
+          <w:i w:val="0"/>
+        </w:rPr>
+        <w:t xml:space="preserve">School-age children and young adults; household or group outbreaks </w:t>
+      </w:r>
+      <w:r>
+        <w:rPr>
+          <w:b w:val="0"/>
+          <w:i w:val="0"/>
+        </w:rPr>
+        <w:t>Slide 89</w:t>
+      </w:r>
+      <w:r>
+        <w:rPr>
+          <w:b w:val="0"/>
+          <w:i w:val="0"/>
+        </w:rPr>
+        <w:t>Risk Factors</w:t>
+      </w:r>
+      <w:r>
+        <w:rPr>
+          <w:b w:val="0"/>
+          <w:i w:val="0"/>
+        </w:rPr>
+        <w:t xml:space="preserve">Outbreak exposure; alcohol and smoking </w:t>
+      </w:r>
+      <w:r>
+        <w:rPr>
+          <w:b w:val="0"/>
+          <w:i w:val="0"/>
+        </w:rPr>
+        <w:t>Slide 28</w:t>
+      </w:r>
+      <w:r>
+        <w:rPr>
+          <w:b w:val="0"/>
+          <w:i w:val="0"/>
+        </w:rPr>
+        <w:t>Pathology</w:t>
+      </w:r>
+      <w:r>
+        <w:rPr>
+          <w:b w:val="0"/>
+          <w:i w:val="0"/>
+        </w:rPr>
+        <w:t>Not covered in the lecture</w:t>
+      </w:r>
+      <w:r>
+        <w:rPr>
+          <w:b w:val="0"/>
+          <w:i w:val="0"/>
+        </w:rPr>
+        <w:t>Clinical Manifestation</w:t>
+      </w:r>
+      <w:r>
+        <w:rPr>
+          <w:b w:val="0"/>
+          <w:i w:val="0"/>
+        </w:rPr>
+        <w:t xml:space="preserve">Gradual fever, persistent cough, headache, variable chest findings; severe or extrapulmonary illness can occur </w:t>
+      </w:r>
+      <w:r>
+        <w:rPr>
+          <w:b w:val="0"/>
+          <w:i w:val="0"/>
+        </w:rPr>
+        <w:t>Slide 89</w:t>
+      </w:r>
+      <w:r>
+        <w:rPr>
+          <w:b w:val="0"/>
+          <w:i w:val="0"/>
+        </w:rPr>
+        <w:t>Diagnosis</w:t>
+      </w:r>
+      <w:r>
+        <w:rPr>
+          <w:b w:val="0"/>
+          <w:i w:val="0"/>
+        </w:rPr>
+        <w:t xml:space="preserve">Respiratory nucleic acid amplification test when results change care </w:t>
+      </w:r>
+      <w:r>
+        <w:rPr>
+          <w:b w:val="0"/>
+          <w:i w:val="0"/>
+        </w:rPr>
+        <w:t>Slide 89</w:t>
+      </w:r>
+      <w:r>
+        <w:rPr>
+          <w:b w:val="0"/>
+          <w:i w:val="0"/>
+        </w:rPr>
+        <w:t>Treatment/Therapy</w:t>
+      </w:r>
+      <w:r>
+        <w:rPr>
+          <w:b w:val="0"/>
+          <w:i w:val="0"/>
+        </w:rPr>
+        <w:t xml:space="preserve">Macrolide or doxycycline (respiratory fluoroquinolone an alternative); </w:t>
+      </w:r>
+      <w:r>
+        <w:rPr>
+          <w:b w:val="0"/>
+          <w:i w:val="0"/>
+          <w:highlight w:val="yellow"/>
+        </w:rPr>
+        <w:t>★ beta-lactams are ineffective: no cell wall</w:t>
+      </w:r>
+      <w:r>
+        <w:rPr>
+          <w:b w:val="0"/>
+          <w:i w:val="0"/>
+        </w:rPr>
+        <w:t xml:space="preserve">; doxycycline after macrolide failure; no vaccine </w:t>
+      </w:r>
+      <w:r>
+        <w:rPr>
+          <w:b w:val="0"/>
+          <w:i w:val="0"/>
+        </w:rPr>
+        <w:t>Slide 89</w:t>
+      </w:r>
+      <w:r>
+        <w:rPr>
+          <w:b w:val="0"/>
+          <w:i w:val="0"/>
+        </w:rPr>
+        <w:t>Mortality ★</w:t>
+      </w:r>
+      <w:r>
+        <w:rPr>
+          <w:b w:val="0"/>
+          <w:i w:val="0"/>
+        </w:rPr>
+        <w:t>Not covered in the lecture</w:t>
+      </w:r>
+    </w:p>
+    <w:p>
+      <w:pPr>
+        <w:spacing w:after="120"/>
+      </w:pPr>
+      <w:r>
+        <w:rPr>
+          <w:b w:val="0"/>
+          <w:i w:val="0"/>
+        </w:rPr>
+        <w:t>Influenza</w:t>
+      </w:r>
+      <w:r>
+        <w:rPr>
+          <w:b w:val="0"/>
+          <w:i w:val="0"/>
+        </w:rPr>
+        <w:t>★ Professor emphasized</w:t>
+      </w:r>
+    </w:p>
+    <w:p>
+      <w:pPr>
+        <w:spacing w:after="120"/>
+      </w:pPr>
+      <w:r>
+        <w:rPr>
+          <w:b w:val="0"/>
+          <w:i w:val="0"/>
+        </w:rPr>
+        <w:t>★ Treat high-risk patients promptly, even after 48 hours; know who avoids which antiviral.</w:t>
+      </w:r>
+    </w:p>
+    <w:p>
+      <w:pPr>
+        <w:spacing w:after="120"/>
+      </w:pPr>
+      <w:r>
+        <w:rPr>
+          <w:b w:val="0"/>
+          <w:i w:val="0"/>
+        </w:rPr>
+        <w:t>Name of Condition</w:t>
+      </w:r>
+      <w:r>
+        <w:rPr>
+          <w:b w:val="0"/>
+          <w:i w:val="0"/>
+        </w:rPr>
+        <w:t xml:space="preserve">Influenza </w:t>
+      </w:r>
+      <w:r>
+        <w:rPr>
+          <w:b w:val="0"/>
+          <w:i w:val="0"/>
+        </w:rPr>
+        <w:t>Slide 91</w:t>
+      </w:r>
+      <w:r>
+        <w:rPr>
+          <w:b w:val="0"/>
+          <w:i w:val="0"/>
+        </w:rPr>
+        <w:t>Definition</w:t>
+      </w:r>
+      <w:r>
+        <w:rPr>
+          <w:b w:val="0"/>
+          <w:i w:val="0"/>
+        </w:rPr>
+        <w:t xml:space="preserve">A highly contagious airborne orthomyxovirus infection </w:t>
+      </w:r>
+      <w:r>
+        <w:rPr>
+          <w:b w:val="0"/>
+          <w:i w:val="0"/>
+        </w:rPr>
+        <w:t>Slide 91</w:t>
+      </w:r>
+      <w:r>
+        <w:rPr>
+          <w:b w:val="0"/>
+          <w:i w:val="0"/>
+        </w:rPr>
+        <w:t>Etiology (cause)</w:t>
+      </w:r>
+      <w:r>
+        <w:rPr>
+          <w:b w:val="0"/>
+          <w:i w:val="0"/>
+        </w:rPr>
+        <w:t xml:space="preserve">Influenza A (more pathogenic, most human infections), B and C; subtypes by hemagglutinin and neuraminidase; antigenic drift and shift </w:t>
+      </w:r>
+      <w:r>
+        <w:rPr>
+          <w:b w:val="0"/>
+          <w:i w:val="0"/>
+        </w:rPr>
+        <w:t>Slides 92–94</w:t>
+      </w:r>
+      <w:r>
+        <w:rPr>
+          <w:b w:val="0"/>
+          <w:i w:val="0"/>
+        </w:rPr>
+        <w:t>Epidemiology (who)</w:t>
+      </w:r>
+      <w:r>
+        <w:rPr>
+          <w:b w:val="0"/>
+          <w:i w:val="0"/>
+        </w:rPr>
+        <w:t xml:space="preserve">Fall and winter epidemics, peaking in mid-February; incubation 1 to 4 days </w:t>
+      </w:r>
+      <w:r>
+        <w:rPr>
+          <w:b w:val="0"/>
+          <w:i w:val="0"/>
+        </w:rPr>
+        <w:t>Slides 95–96</w:t>
+      </w:r>
+      <w:r>
+        <w:rPr>
+          <w:b w:val="0"/>
+          <w:i w:val="0"/>
+        </w:rPr>
+        <w:t>Risk Factors</w:t>
+      </w:r>
+      <w:r>
+        <w:rPr>
+          <w:b w:val="0"/>
+          <w:i w:val="0"/>
+        </w:rPr>
+        <w:t xml:space="preserve">Severe disease: under 5, 65 and older, long-term care, immunocompromise, chronic organ disease, pregnancy and 2 weeks postpartum, severe obesity </w:t>
+      </w:r>
+      <w:r>
+        <w:rPr>
+          <w:b w:val="0"/>
+          <w:i w:val="0"/>
+        </w:rPr>
+        <w:t>Slides 97–98</w:t>
+      </w:r>
+      <w:r>
+        <w:rPr>
+          <w:b w:val="0"/>
+          <w:i w:val="0"/>
+        </w:rPr>
+        <w:t>Pathology</w:t>
+      </w:r>
+      <w:r>
+        <w:rPr>
+          <w:b w:val="0"/>
+          <w:i w:val="0"/>
+        </w:rPr>
+        <w:t xml:space="preserve">Influenza pneumonia: primary viral or secondary bacterial (pneumococcal or staphylococcal) </w:t>
+      </w:r>
+      <w:r>
+        <w:rPr>
+          <w:b w:val="0"/>
+          <w:i w:val="0"/>
+        </w:rPr>
+        <w:t>Slide 106</w:t>
+      </w:r>
+      <w:r>
+        <w:rPr>
+          <w:b w:val="0"/>
+          <w:i w:val="0"/>
+        </w:rPr>
+        <w:t>Clinical Manifestation</w:t>
+      </w:r>
+      <w:r>
+        <w:rPr>
+          <w:b w:val="0"/>
+          <w:i w:val="0"/>
+        </w:rPr>
+        <w:t xml:space="preserve">Sudden onset: fever 100 to 104 F, cough, sore throat, myalgias, frontal or retro-orbital headache, severe fatigue, red watery eyes, diarrhea in children; wheezes or rhonchi, tachycardia, dry skin </w:t>
+      </w:r>
+      <w:r>
+        <w:rPr>
+          <w:b w:val="0"/>
+          <w:i w:val="0"/>
+        </w:rPr>
+        <w:t>Slides 99–102</w:t>
+      </w:r>
+      <w:r>
+        <w:rPr>
+          <w:b w:val="0"/>
+          <w:i w:val="0"/>
+        </w:rPr>
+        <w:t>Diagnosis</w:t>
+      </w:r>
+      <w:r>
+        <w:rPr>
+          <w:b w:val="0"/>
+          <w:i w:val="0"/>
+          <w:highlight w:val="yellow"/>
+        </w:rPr>
+        <w:t>★ Rapid molecular assay or reverse-transcription polymerase chain reaction</w:t>
+      </w:r>
+      <w:r>
+        <w:rPr>
+          <w:b w:val="0"/>
+          <w:i w:val="0"/>
+        </w:rPr>
+        <w:t xml:space="preserve">; a negative rapid antigen test does not exclude; do not wait for results in hospitalized or high-risk patients; chest film to rule out pneumonia in the elderly or high-risk </w:t>
+      </w:r>
+      <w:r>
+        <w:rPr>
+          <w:b w:val="0"/>
+          <w:i w:val="0"/>
+        </w:rPr>
+        <w:t>Slides 95, 104–106</w:t>
+      </w:r>
+      <w:r>
+        <w:rPr>
+          <w:b w:val="0"/>
+          <w:i w:val="0"/>
+        </w:rPr>
+        <w:t>Treatment/Therapy</w:t>
+      </w:r>
+      <w:r>
+        <w:rPr>
+          <w:b w:val="0"/>
+          <w:i w:val="0"/>
+          <w:highlight w:val="yellow"/>
+        </w:rPr>
+        <w:t>★ Oseltamivir preferred</w:t>
+      </w:r>
+      <w:r>
+        <w:rPr>
+          <w:b w:val="0"/>
+          <w:i w:val="0"/>
+        </w:rPr>
+        <w:t xml:space="preserve"> (hospitalized, severe, high-risk, pregnancy), even after 48 hours; baloxavir single dose within 48 hours but not in pregnancy, breastfeeding, severe immunosuppression or hospitalized patients; avoid inhaled zanamivir in asthma or chronic obstructive pulmonary disease; amantadine and rimantadine not recommended; avoid aspirin under 18 (Reye syndrome); annual vaccination </w:t>
+      </w:r>
+      <w:r>
+        <w:rPr>
+          <w:b w:val="0"/>
+          <w:i w:val="0"/>
+        </w:rPr>
+        <w:t>Slides 4–6, 107–110</w:t>
+      </w:r>
+      <w:r>
+        <w:rPr>
+          <w:b w:val="0"/>
+          <w:i w:val="0"/>
+        </w:rPr>
+        <w:t>Mortality ★</w:t>
+      </w:r>
+      <w:r>
+        <w:rPr>
+          <w:b w:val="0"/>
+          <w:i w:val="0"/>
+        </w:rPr>
+        <w:t xml:space="preserve">3 to 5 million cases and 250,000 to 500,000 deaths worldwide a year (context only) </w:t>
+      </w:r>
+      <w:r>
+        <w:rPr>
+          <w:b w:val="0"/>
+          <w:i w:val="0"/>
+        </w:rPr>
+        <w:t>Slide 96</w:t>
+      </w:r>
+    </w:p>
+    <w:p>
+      <w:pPr>
+        <w:spacing w:after="120"/>
+      </w:pPr>
+      <w:r>
+        <w:rPr>
+          <w:b w:val="0"/>
+          <w:i w:val="0"/>
+        </w:rPr>
+        <w:t>COVID-19</w:t>
+      </w:r>
+      <w:r>
+        <w:rPr>
+          <w:b w:val="0"/>
+          <w:i w:val="0"/>
+        </w:rPr>
+        <w:t>★ Professor emphasized</w:t>
+      </w:r>
+      <w:r>
+        <w:rPr>
+          <w:b w:val="0"/>
+          <w:i w:val="0"/>
+        </w:rPr>
+        <w:t>2 not covered</w:t>
+      </w:r>
+    </w:p>
+    <w:p>
+      <w:pPr>
+        <w:spacing w:after="120"/>
+      </w:pPr>
+      <w:r>
+        <w:rPr>
+          <w:b w:val="0"/>
+          <w:i w:val="0"/>
+        </w:rPr>
+        <w:t>★ Stratify severity first; oxygenation decides the pathway.</w:t>
+      </w:r>
+    </w:p>
+    <w:p>
+      <w:pPr>
+        <w:spacing w:after="120"/>
+      </w:pPr>
+      <w:r>
+        <w:rPr>
+          <w:b w:val="0"/>
+          <w:i w:val="0"/>
+        </w:rPr>
+        <w:t>Name of Condition</w:t>
+      </w:r>
+      <w:r>
+        <w:rPr>
+          <w:b w:val="0"/>
+          <w:i w:val="0"/>
+        </w:rPr>
+        <w:t xml:space="preserve">Coronavirus disease 2019 (COVID-19) </w:t>
+      </w:r>
+      <w:r>
+        <w:rPr>
+          <w:b w:val="0"/>
+          <w:i w:val="0"/>
+        </w:rPr>
+        <w:t>Slides 111–112</w:t>
+      </w:r>
+      <w:r>
+        <w:rPr>
+          <w:b w:val="0"/>
+          <w:i w:val="0"/>
+        </w:rPr>
+        <w:t>Definition</w:t>
+      </w:r>
+      <w:r>
+        <w:rPr>
+          <w:b w:val="0"/>
+          <w:i w:val="0"/>
+        </w:rPr>
+        <w:t xml:space="preserve">Disease caused by SARS-CoV-2 (severe acute respiratory syndrome coronavirus 2), from asymptomatic infection to respiratory failure </w:t>
+      </w:r>
+      <w:r>
+        <w:rPr>
+          <w:b w:val="0"/>
+          <w:i w:val="0"/>
+        </w:rPr>
+        <w:t>Slide 112</w:t>
+      </w:r>
+      <w:r>
+        <w:rPr>
+          <w:b w:val="0"/>
+          <w:i w:val="0"/>
+        </w:rPr>
+        <w:t>Etiology (cause)</w:t>
+      </w:r>
+      <w:r>
+        <w:rPr>
+          <w:b w:val="0"/>
+          <w:i w:val="0"/>
+        </w:rPr>
+        <w:t xml:space="preserve">The virus, spread mainly by inhaling infectious respiratory particles, especially indoors with poor ventilation </w:t>
+      </w:r>
+      <w:r>
+        <w:rPr>
+          <w:b w:val="0"/>
+          <w:i w:val="0"/>
+        </w:rPr>
+        <w:t>Slide 112</w:t>
+      </w:r>
+      <w:r>
+        <w:rPr>
+          <w:b w:val="0"/>
+          <w:i w:val="0"/>
+        </w:rPr>
+        <w:t>Epidemiology (who)</w:t>
+      </w:r>
+      <w:r>
+        <w:rPr>
+          <w:b w:val="0"/>
+          <w:i w:val="0"/>
+        </w:rPr>
+        <w:t xml:space="preserve">Median incubation about 5 days; 18 to 33% asymptomatic </w:t>
+      </w:r>
+      <w:r>
+        <w:rPr>
+          <w:b w:val="0"/>
+          <w:i w:val="0"/>
+        </w:rPr>
+        <w:t>Slide 114</w:t>
+      </w:r>
+      <w:r>
+        <w:rPr>
+          <w:b w:val="0"/>
+          <w:i w:val="0"/>
+        </w:rPr>
+        <w:t>Risk Factors</w:t>
+      </w:r>
+      <w:r>
+        <w:rPr>
+          <w:b w:val="0"/>
+          <w:i w:val="0"/>
+        </w:rPr>
+        <w:t xml:space="preserve">Age (risk rises substantially above 65), immunocompromise, multiple chronic conditions, lack of current vaccination </w:t>
+      </w:r>
+      <w:r>
+        <w:rPr>
+          <w:b w:val="0"/>
+          <w:i w:val="0"/>
+        </w:rPr>
+        <w:t>Slide 113</w:t>
+      </w:r>
+      <w:r>
+        <w:rPr>
+          <w:b w:val="0"/>
+          <w:i w:val="0"/>
+        </w:rPr>
+        <w:t>Pathology</w:t>
+      </w:r>
+      <w:r>
+        <w:rPr>
+          <w:b w:val="0"/>
+          <w:i w:val="0"/>
+        </w:rPr>
+        <w:t>Not covered in the lecture</w:t>
+      </w:r>
+      <w:r>
+        <w:rPr>
+          <w:b w:val="0"/>
+          <w:i w:val="0"/>
+        </w:rPr>
+        <w:t>Clinical Manifestation</w:t>
+      </w:r>
+      <w:r>
+        <w:rPr>
+          <w:b w:val="0"/>
+          <w:i w:val="0"/>
+        </w:rPr>
+        <w:t xml:space="preserve">Cough, shortness of breath, fever, myalgia, headache; less often sore throat, anosmia, dysgeusia, anorexia, nausea or diarrhea </w:t>
+      </w:r>
+      <w:r>
+        <w:rPr>
+          <w:b w:val="0"/>
+          <w:i w:val="0"/>
+        </w:rPr>
+        <w:t>Slides 114–115</w:t>
+      </w:r>
+      <w:r>
+        <w:rPr>
+          <w:b w:val="0"/>
+          <w:i w:val="0"/>
+        </w:rPr>
+        <w:t>Diagnosis</w:t>
+      </w:r>
+      <w:r>
+        <w:rPr>
+          <w:b w:val="0"/>
+          <w:i w:val="0"/>
+          <w:highlight w:val="yellow"/>
+        </w:rPr>
+        <w:t>★ Nucleic acid amplification test (including polymerase chain reaction) most sensitive</w:t>
+      </w:r>
+      <w:r>
+        <w:rPr>
+          <w:b w:val="0"/>
+          <w:i w:val="0"/>
+        </w:rPr>
+        <w:t xml:space="preserve">; repeat a negative antigen test after 48 hours (2 tests if symptomatic, 3 if not); imaging for pneumonia and complications; D-dimer alone does not diagnose thrombosis. Severity: mild (no dyspnea, normal film), moderate (abnormal film, saturation 94% or more), severe (below 94%, infiltrates over 50%), critical </w:t>
+      </w:r>
+      <w:r>
+        <w:rPr>
+          <w:b w:val="0"/>
+          <w:i w:val="0"/>
+        </w:rPr>
+        <w:t>Slides 117, 119</w:t>
+      </w:r>
+      <w:r>
+        <w:rPr>
+          <w:b w:val="0"/>
+          <w:i w:val="0"/>
+        </w:rPr>
+        <w:t>Treatment/Therapy</w:t>
+      </w:r>
+      <w:r>
+        <w:rPr>
+          <w:b w:val="0"/>
+          <w:i w:val="0"/>
+        </w:rPr>
+        <w:t xml:space="preserve">High-risk outpatients without hypoxemia: nirmatrelvir/ritonavir within 5 days (check interactions, renal dosing, hepatic contraindications) or 3-day remdesivir within 7 days; molnupiravir only if these are unsuitable, avoid in pregnancy; no steroids without hypoxemia. Hypoxemic inpatients: dexamethasone, consider remdesivir, baricitinib or tocilizumab for rapid progression, thromboprophylaxis </w:t>
+      </w:r>
+      <w:r>
+        <w:rPr>
+          <w:b w:val="0"/>
+          <w:i w:val="0"/>
+        </w:rPr>
+        <w:t>Slides 120–122</w:t>
+      </w:r>
+      <w:r>
+        <w:rPr>
+          <w:b w:val="0"/>
+          <w:i w:val="0"/>
+        </w:rPr>
+        <w:t>Mortality ★</w:t>
+      </w:r>
+      <w:r>
+        <w:rPr>
+          <w:b w:val="0"/>
+          <w:i w:val="0"/>
+        </w:rPr>
+        <w:t>Not covered in the lecture</w:t>
+      </w:r>
+    </w:p>
+    <w:p>
+      <w:pPr>
+        <w:pStyle w:val="Heading1"/>
+        <w:spacing w:before="280" w:after="100"/>
+      </w:pPr>
+      <w:r>
+        <w:rPr>
+          <w:rFonts w:ascii="Georgia" w:hAnsi="Georgia"/>
+          <w:color w:val="7A2D30"/>
+        </w:rPr>
+        <w:t>Lecture 38 · Mycobacterial Infections, Including Tuberculosis</w:t>
+      </w:r>
+    </w:p>
+    <w:p>
+      <w:pPr>
+        <w:spacing w:after="120"/>
+      </w:pPr>
+      <w:r>
+        <w:rPr>
+          <w:b w:val="0"/>
+          <w:i w:val="0"/>
+        </w:rPr>
+        <w:t>Robert Bobilin, MS, MPAS, PA-C, Emeritus (guest lecturer) · 3 conditions · source: 38. Mycobacterial Infections including Tuberculosis - Bobilin - 10-29-2025 SV.pptx</w:t>
+      </w:r>
+    </w:p>
+    <w:p>
+      <w:pPr>
+        <w:spacing w:after="120"/>
+      </w:pPr>
+      <w:r>
+        <w:rPr>
+          <w:b/>
+          <w:i w:val="0"/>
+        </w:rPr>
+        <w:t>Note:</w:t>
+      </w:r>
+      <w:r>
+        <w:rPr>
+          <w:b w:val="0"/>
+          <w:i w:val="0"/>
+        </w:rPr>
+        <w:t xml:space="preserve"> Built from the slides plus the Zoom recording, which only chooses which facts to star. Where the lecturer called fever and night sweats 'pathognomonic', the slide (a list of manifestations) is followed. Epidemiology figures are context only. Dosing is left out.</w:t>
+      </w:r>
+    </w:p>
+    <w:p>
+      <w:pPr>
+        <w:spacing w:after="120"/>
+      </w:pPr>
+      <w:r>
+        <w:rPr>
+          <w:b w:val="0"/>
+          <w:i w:val="0"/>
+        </w:rPr>
+        <w:t>Tuberculosis (pulmonary and extrapulmonary)</w:t>
+      </w:r>
+      <w:r>
+        <w:rPr>
+          <w:b w:val="0"/>
+          <w:i w:val="0"/>
+        </w:rPr>
+        <w:t>★ Professor emphasized</w:t>
+      </w:r>
+    </w:p>
+    <w:p>
+      <w:pPr>
+        <w:spacing w:after="120"/>
+      </w:pPr>
+      <w:r>
+        <w:rPr>
+          <w:b w:val="0"/>
+          <w:i w:val="0"/>
+        </w:rPr>
+        <w:t>★ Infection versus disease decides infectiousness, evaluation and treatment; know the 5, 10 and 15 mm cut-offs, 3 sputum specimens, isolation and notification, and the 2 + 4 month regimen.</w:t>
+      </w:r>
+    </w:p>
+    <w:p>
+      <w:pPr>
+        <w:spacing w:after="120"/>
+      </w:pPr>
+      <w:r>
+        <w:rPr>
+          <w:b w:val="0"/>
+          <w:i w:val="0"/>
+        </w:rPr>
+        <w:t>Name of Condition</w:t>
+      </w:r>
+      <w:r>
+        <w:rPr>
+          <w:b w:val="0"/>
+          <w:i w:val="0"/>
+        </w:rPr>
+        <w:t xml:space="preserve">Tuberculosis (TB) disease </w:t>
+      </w:r>
+      <w:r>
+        <w:rPr>
+          <w:b w:val="0"/>
+          <w:i w:val="0"/>
+        </w:rPr>
+        <w:t>Slide 5</w:t>
+      </w:r>
+      <w:r>
+        <w:rPr>
+          <w:b w:val="0"/>
+          <w:i w:val="0"/>
+        </w:rPr>
+        <w:t>Definition</w:t>
+      </w:r>
+      <w:r>
+        <w:rPr>
+          <w:b w:val="0"/>
+          <w:i w:val="0"/>
+        </w:rPr>
+        <w:t xml:space="preserve">A chronic granulomatous disease caused by Mycobacterium tuberculosis, usually of the lung but able to reach any organ by hematogenous spread </w:t>
+      </w:r>
+      <w:r>
+        <w:rPr>
+          <w:b w:val="0"/>
+          <w:i w:val="0"/>
+        </w:rPr>
+        <w:t>Slide 12</w:t>
+      </w:r>
+      <w:r>
+        <w:rPr>
+          <w:b w:val="0"/>
+          <w:i w:val="0"/>
+        </w:rPr>
+        <w:t>Etiology (cause)</w:t>
+      </w:r>
+      <w:r>
+        <w:rPr>
+          <w:b w:val="0"/>
+          <w:i w:val="0"/>
+        </w:rPr>
+        <w:t xml:space="preserve">Mycobacterium tuberculosis complex (M. tuberculosis the principal human pathogen; also M. bovis, M. africanum): acid-fast bacilli with lipid-rich, mycolic-acid walls; slow growing </w:t>
+      </w:r>
+      <w:r>
+        <w:rPr>
+          <w:b w:val="0"/>
+          <w:i w:val="0"/>
+        </w:rPr>
+        <w:t>Slides 4–5</w:t>
+      </w:r>
+      <w:r>
+        <w:rPr>
+          <w:b w:val="0"/>
+          <w:i w:val="0"/>
+        </w:rPr>
+        <w:t>Epidemiology (who)</w:t>
+      </w:r>
+      <w:r>
+        <w:rPr>
+          <w:b w:val="0"/>
+          <w:i w:val="0"/>
+        </w:rPr>
+        <w:t xml:space="preserve">Leading cause of death from a single infectious agent worldwide; about a quarter of the world infected; in the United States most cases occur in people born outside the country </w:t>
+      </w:r>
+      <w:r>
+        <w:rPr>
+          <w:b w:val="0"/>
+          <w:i w:val="0"/>
+        </w:rPr>
+        <w:t>Slides 6–7</w:t>
+      </w:r>
+      <w:r>
+        <w:rPr>
+          <w:b w:val="0"/>
+          <w:i w:val="0"/>
+        </w:rPr>
+        <w:t>Risk Factors</w:t>
+      </w:r>
+      <w:r>
+        <w:rPr>
+          <w:b w:val="0"/>
+          <w:i w:val="0"/>
+        </w:rPr>
+        <w:t xml:space="preserve">Exposure: close contact, enclosed poorly ventilated spaces, settings with ongoing transmission, high-incidence areas. </w:t>
+      </w:r>
+      <w:r>
+        <w:rPr>
+          <w:b w:val="0"/>
+          <w:i w:val="0"/>
+          <w:highlight w:val="yellow"/>
+        </w:rPr>
+        <w:t>★ Progression: HIV or major immunosuppression, tumor necrosis factor inhibitors, transplant, prolonged steroids, infection within 2 years, infancy and young childhood</w:t>
+      </w:r>
+      <w:r>
+        <w:rPr>
+          <w:b w:val="0"/>
+          <w:i w:val="0"/>
+        </w:rPr>
+        <w:t xml:space="preserve">; also diabetes, chronic kidney disease or dialysis, silicosis, low weight, tobacco and alcohol </w:t>
+      </w:r>
+      <w:r>
+        <w:rPr>
+          <w:b w:val="0"/>
+          <w:i w:val="0"/>
+        </w:rPr>
+        <w:t>Slides 14–15</w:t>
+      </w:r>
+      <w:r>
+        <w:rPr>
+          <w:b w:val="0"/>
+          <w:i w:val="0"/>
+        </w:rPr>
+        <w:t>Pathology</w:t>
+      </w:r>
+      <w:r>
+        <w:rPr>
+          <w:b w:val="0"/>
+          <w:i w:val="0"/>
+        </w:rPr>
+        <w:t xml:space="preserve">Primary infection contained, or progressive primary disease when containment fails; latent foci reactivate with impaired immunity (secondary tuberculosis); caseation, cavities, miliary dissemination </w:t>
+      </w:r>
+      <w:r>
+        <w:rPr>
+          <w:b w:val="0"/>
+          <w:i w:val="0"/>
+        </w:rPr>
+        <w:t>Slides 9–10, 12</w:t>
+      </w:r>
+      <w:r>
+        <w:rPr>
+          <w:b w:val="0"/>
+          <w:i w:val="0"/>
+        </w:rPr>
+        <w:t>Clinical Manifestation</w:t>
+      </w:r>
+      <w:r>
+        <w:rPr>
+          <w:b w:val="0"/>
+          <w:i w:val="0"/>
+        </w:rPr>
+        <w:t xml:space="preserve">Persistent cough, hemoptysis or pleuritic pain, fever and night sweats, weight loss, fatigue; may be mild or absent; exam has limited sensitivity and a normal exam does not exclude it. Extrapulmonary: painless lymph node enlargement, pleural effusion, central nervous system (headache, altered mental status), spine (back pain, vertebral destruction), disseminated disease </w:t>
+      </w:r>
+      <w:r>
+        <w:rPr>
+          <w:b w:val="0"/>
+          <w:i w:val="0"/>
+        </w:rPr>
+        <w:t>Slides 8, 16–17</w:t>
+      </w:r>
+      <w:r>
+        <w:rPr>
+          <w:b w:val="0"/>
+          <w:i w:val="0"/>
+        </w:rPr>
+        <w:t>Diagnosis</w:t>
+      </w:r>
+      <w:r>
+        <w:rPr>
+          <w:b w:val="0"/>
+          <w:i w:val="0"/>
+        </w:rPr>
+        <w:t xml:space="preserve">Tuberculin skin test or interferon-gamma release assay shows infection only. </w:t>
+      </w:r>
+      <w:r>
+        <w:rPr>
+          <w:b w:val="0"/>
+          <w:i w:val="0"/>
+          <w:highlight w:val="yellow"/>
+        </w:rPr>
+        <w:t>★ 3 sputum specimens 8 to 24 hours apart (one early morning): smear, culture, a rapid molecular test, susceptibility testing</w:t>
+      </w:r>
+      <w:r>
+        <w:rPr>
+          <w:b w:val="0"/>
+          <w:i w:val="0"/>
+        </w:rPr>
+        <w:t xml:space="preserve">; HIV test; chest film (upper-lobe cavities after primary, hilar adenopathy in primary, miliary nodules); imaging cannot confirm </w:t>
+      </w:r>
+      <w:r>
+        <w:rPr>
+          <w:b w:val="0"/>
+          <w:i w:val="0"/>
+        </w:rPr>
+        <w:t>Slides 19–29</w:t>
+      </w:r>
+      <w:r>
+        <w:rPr>
+          <w:b w:val="0"/>
+          <w:i w:val="0"/>
+        </w:rPr>
+        <w:t>Treatment/Therapy</w:t>
+      </w:r>
+      <w:r>
+        <w:rPr>
+          <w:b w:val="0"/>
+          <w:i w:val="0"/>
+          <w:highlight w:val="yellow"/>
+        </w:rPr>
+        <w:t>★ Notify the tuberculosis program; airborne isolation room; N95; source control; end isolation by criteria</w:t>
+      </w:r>
+      <w:r>
+        <w:rPr>
+          <w:b w:val="0"/>
+          <w:i w:val="0"/>
+        </w:rPr>
+        <w:t xml:space="preserve">. 2 months of isoniazid, rifampin, pyrazinamide and ethambutol, then 4 months of isoniazid and rifampin (ethambutol stops once susceptibility is known), daily directly observed therapy; 17-week rifapentine-moxifloxacin regimen from age 12; rifampin resistance needs expert management; monthly monitoring for liver injury, interactions, toxicity </w:t>
+      </w:r>
+      <w:r>
+        <w:rPr>
+          <w:b w:val="0"/>
+          <w:i w:val="0"/>
+        </w:rPr>
+        <w:t>Slides 33–36</w:t>
+      </w:r>
+      <w:r>
+        <w:rPr>
+          <w:b w:val="0"/>
+          <w:i w:val="0"/>
+        </w:rPr>
+        <w:t>Mortality ★</w:t>
+      </w:r>
+      <w:r>
+        <w:rPr>
+          <w:b w:val="0"/>
+          <w:i w:val="0"/>
+        </w:rPr>
+        <w:t xml:space="preserve">Preventable and curable; post-tuberculosis bronchiectasis and scarring possible </w:t>
+      </w:r>
+      <w:r>
+        <w:rPr>
+          <w:b w:val="0"/>
+          <w:i w:val="0"/>
+        </w:rPr>
+        <w:t>Slides 6, 29</w:t>
+      </w:r>
+    </w:p>
+    <w:p>
+      <w:pPr>
+        <w:spacing w:after="120"/>
+      </w:pPr>
+      <w:r>
+        <w:rPr>
+          <w:b w:val="0"/>
+          <w:i w:val="0"/>
+        </w:rPr>
+        <w:t>Latent tuberculosis infection</w:t>
+      </w:r>
+      <w:r>
+        <w:rPr>
+          <w:b w:val="0"/>
+          <w:i w:val="0"/>
+        </w:rPr>
+        <w:t>★ Professor emphasized</w:t>
+      </w:r>
+      <w:r>
+        <w:rPr>
+          <w:b w:val="0"/>
+          <w:i w:val="0"/>
+        </w:rPr>
+        <w:t>1 not covered</w:t>
+      </w:r>
+    </w:p>
+    <w:p>
+      <w:pPr>
+        <w:spacing w:after="120"/>
+      </w:pPr>
+      <w:r>
+        <w:rPr>
+          <w:b w:val="0"/>
+          <w:i w:val="0"/>
+        </w:rPr>
+        <w:t>★ Asymptomatic and not infectious; exclude disease before treating; know the 5, 10 and 15 mm skin test cut-offs.</w:t>
+      </w:r>
+    </w:p>
+    <w:p>
+      <w:pPr>
+        <w:spacing w:after="120"/>
+      </w:pPr>
+      <w:r>
+        <w:rPr>
+          <w:b w:val="0"/>
+          <w:i w:val="0"/>
+        </w:rPr>
+        <w:t>Name of Condition</w:t>
+      </w:r>
+      <w:r>
+        <w:rPr>
+          <w:b w:val="0"/>
+          <w:i w:val="0"/>
+        </w:rPr>
+        <w:t xml:space="preserve">Latent tuberculosis infection (LTBI) </w:t>
+      </w:r>
+      <w:r>
+        <w:rPr>
+          <w:b w:val="0"/>
+          <w:i w:val="0"/>
+        </w:rPr>
+        <w:t>Slide 10</w:t>
+      </w:r>
+      <w:r>
+        <w:rPr>
+          <w:b w:val="0"/>
+          <w:i w:val="0"/>
+        </w:rPr>
+        <w:t>Definition</w:t>
+      </w:r>
+      <w:r>
+        <w:rPr>
+          <w:b w:val="0"/>
+          <w:i w:val="0"/>
+        </w:rPr>
+        <w:t xml:space="preserve">Infection with Mycobacterium tuberculosis without disease: asymptomatic, not infectious, no evidence of disease after clinical evaluation </w:t>
+      </w:r>
+      <w:r>
+        <w:rPr>
+          <w:b w:val="0"/>
+          <w:i w:val="0"/>
+        </w:rPr>
+        <w:t>Slide 10</w:t>
+      </w:r>
+      <w:r>
+        <w:rPr>
+          <w:b w:val="0"/>
+          <w:i w:val="0"/>
+        </w:rPr>
+        <w:t>Etiology (cause)</w:t>
+      </w:r>
+      <w:r>
+        <w:rPr>
+          <w:b w:val="0"/>
+          <w:i w:val="0"/>
+        </w:rPr>
+        <w:t xml:space="preserve">Mycobacterium tuberculosis contained by the immune system </w:t>
+      </w:r>
+      <w:r>
+        <w:rPr>
+          <w:b w:val="0"/>
+          <w:i w:val="0"/>
+        </w:rPr>
+        <w:t>Slides 10, 12</w:t>
+      </w:r>
+      <w:r>
+        <w:rPr>
+          <w:b w:val="0"/>
+          <w:i w:val="0"/>
+        </w:rPr>
+        <w:t>Epidemiology (who)</w:t>
+      </w:r>
+      <w:r>
+        <w:rPr>
+          <w:b w:val="0"/>
+          <w:i w:val="0"/>
+        </w:rPr>
+        <w:t xml:space="preserve">About a quarter of the world's population has been infected </w:t>
+      </w:r>
+      <w:r>
+        <w:rPr>
+          <w:b w:val="0"/>
+          <w:i w:val="0"/>
+        </w:rPr>
+        <w:t>Slide 6</w:t>
+      </w:r>
+      <w:r>
+        <w:rPr>
+          <w:b w:val="0"/>
+          <w:i w:val="0"/>
+        </w:rPr>
+        <w:t>Risk Factors</w:t>
+      </w:r>
+      <w:r>
+        <w:rPr>
+          <w:b w:val="0"/>
+          <w:i w:val="0"/>
+        </w:rPr>
+        <w:t xml:space="preserve">Exposure risk; reactivation risk with impaired immunity </w:t>
+      </w:r>
+      <w:r>
+        <w:rPr>
+          <w:b w:val="0"/>
+          <w:i w:val="0"/>
+        </w:rPr>
+        <w:t>Slides 14–15</w:t>
+      </w:r>
+      <w:r>
+        <w:rPr>
+          <w:b w:val="0"/>
+          <w:i w:val="0"/>
+        </w:rPr>
+        <w:t>Pathology</w:t>
+      </w:r>
+      <w:r>
+        <w:rPr>
+          <w:b w:val="0"/>
+          <w:i w:val="0"/>
+        </w:rPr>
+        <w:t xml:space="preserve">Foci can harbor viable organisms for years and reactivate when immunity falls </w:t>
+      </w:r>
+      <w:r>
+        <w:rPr>
+          <w:b w:val="0"/>
+          <w:i w:val="0"/>
+        </w:rPr>
+        <w:t>Slide 12</w:t>
+      </w:r>
+      <w:r>
+        <w:rPr>
+          <w:b w:val="0"/>
+          <w:i w:val="0"/>
+        </w:rPr>
+        <w:t>Clinical Manifestation</w:t>
+      </w:r>
+      <w:r>
+        <w:rPr>
+          <w:b w:val="0"/>
+          <w:i w:val="0"/>
+        </w:rPr>
+        <w:t xml:space="preserve">None; chest film usually normal </w:t>
+      </w:r>
+      <w:r>
+        <w:rPr>
+          <w:b w:val="0"/>
+          <w:i w:val="0"/>
+        </w:rPr>
+        <w:t>Slides 10, 29</w:t>
+      </w:r>
+      <w:r>
+        <w:rPr>
+          <w:b w:val="0"/>
+          <w:i w:val="0"/>
+        </w:rPr>
+        <w:t>Diagnosis</w:t>
+      </w:r>
+      <w:r>
+        <w:rPr>
+          <w:b w:val="0"/>
+          <w:i w:val="0"/>
+          <w:highlight w:val="yellow"/>
+        </w:rPr>
+        <w:t>★ Tuberculin skin test thresholds: 5 mm (HIV, recent close contact, transplant, major immunosuppression, imaging of prior tuberculosis), 10 mm (exposure or medical risk, congregate settings, children under 5), 15 mm (no risk factors)</w:t>
+      </w:r>
+      <w:r>
+        <w:rPr>
+          <w:b w:val="0"/>
+          <w:i w:val="0"/>
+        </w:rPr>
+        <w:t xml:space="preserve">; measure induration, not erythema, at 48 to 72 hours; the interferon-gamma release assay is preferred after BCG (bacille Calmette-Guerin) vaccination; repeat 8 to 10 weeks after exposure if early tests are negative; neither test separates latent infection from disease </w:t>
+      </w:r>
+      <w:r>
+        <w:rPr>
+          <w:b w:val="0"/>
+          <w:i w:val="0"/>
+        </w:rPr>
+        <w:t>Slides 19–25</w:t>
+      </w:r>
+      <w:r>
+        <w:rPr>
+          <w:b w:val="0"/>
+          <w:i w:val="0"/>
+        </w:rPr>
+        <w:t>Treatment/Therapy</w:t>
+      </w:r>
+      <w:r>
+        <w:rPr>
+          <w:b w:val="0"/>
+          <w:i w:val="0"/>
+        </w:rPr>
+        <w:t xml:space="preserve">Exclude disease first; 3HP (weekly isoniazid plus rifapentine for 3 months), 4R (daily rifampin for 4 months) or 3HR (daily isoniazid plus rifampin for 3 months); 6H or 9H when rifamycins are unsuitable; check interactions, pregnancy and source-case resistance </w:t>
+      </w:r>
+      <w:r>
+        <w:rPr>
+          <w:b w:val="0"/>
+          <w:i w:val="0"/>
+        </w:rPr>
+        <w:t>Slide 37</w:t>
+      </w:r>
+      <w:r>
+        <w:rPr>
+          <w:b w:val="0"/>
+          <w:i w:val="0"/>
+        </w:rPr>
+        <w:t>Mortality ★</w:t>
+      </w:r>
+      <w:r>
+        <w:rPr>
+          <w:b w:val="0"/>
+          <w:i w:val="0"/>
+        </w:rPr>
+        <w:t>Not covered in the lecture</w:t>
+      </w:r>
+    </w:p>
+    <w:p>
+      <w:pPr>
+        <w:spacing w:after="120"/>
+      </w:pPr>
+      <w:r>
+        <w:rPr>
+          <w:b w:val="0"/>
+          <w:i w:val="0"/>
+        </w:rPr>
+        <w:t>Nontuberculous mycobacterial lung disease</w:t>
+      </w:r>
+      <w:r>
+        <w:rPr>
+          <w:b w:val="0"/>
+          <w:i w:val="0"/>
+        </w:rPr>
+        <w:t>1 not covered</w:t>
+      </w:r>
+      <w:r>
+        <w:br/>
+      </w:r>
+      <w:r>
+        <w:rPr>
+          <w:b w:val="0"/>
+          <w:i w:val="0"/>
+        </w:rPr>
+        <w:t>Name of Condition</w:t>
+      </w:r>
+      <w:r>
+        <w:rPr>
+          <w:b w:val="0"/>
+          <w:i w:val="0"/>
+        </w:rPr>
+        <w:t xml:space="preserve">Nontuberculous mycobacterial (NTM) lung disease (atypical mycobacterial disease) </w:t>
+      </w:r>
+      <w:r>
+        <w:rPr>
+          <w:b w:val="0"/>
+          <w:i w:val="0"/>
+        </w:rPr>
+        <w:t>Slide 38</w:t>
+      </w:r>
+      <w:r>
+        <w:rPr>
+          <w:b w:val="0"/>
+          <w:i w:val="0"/>
+        </w:rPr>
+        <w:t>Definition</w:t>
+      </w:r>
+      <w:r>
+        <w:rPr>
+          <w:b w:val="0"/>
+          <w:i w:val="0"/>
+        </w:rPr>
+        <w:t xml:space="preserve">Pulmonary or extrapulmonary disease from environmental mycobacteria; a respiratory isolate alone does not prove disease </w:t>
+      </w:r>
+      <w:r>
+        <w:rPr>
+          <w:b w:val="0"/>
+          <w:i w:val="0"/>
+        </w:rPr>
+        <w:t>Slide 38</w:t>
+      </w:r>
+      <w:r>
+        <w:rPr>
+          <w:b w:val="0"/>
+          <w:i w:val="0"/>
+        </w:rPr>
+        <w:t>Etiology (cause)</w:t>
+      </w:r>
+      <w:r>
+        <w:rPr>
+          <w:b w:val="0"/>
+          <w:i w:val="0"/>
+        </w:rPr>
+        <w:t xml:space="preserve">Mycobacterium avium complex (MAC, a common cause), M. kansasii, M. abscessus </w:t>
+      </w:r>
+      <w:r>
+        <w:rPr>
+          <w:b w:val="0"/>
+          <w:i w:val="0"/>
+        </w:rPr>
+        <w:t>Slides 5, 38</w:t>
+      </w:r>
+      <w:r>
+        <w:rPr>
+          <w:b w:val="0"/>
+          <w:i w:val="0"/>
+        </w:rPr>
+        <w:t>Epidemiology (who)</w:t>
+      </w:r>
+      <w:r>
+        <w:rPr>
+          <w:b w:val="0"/>
+          <w:i w:val="0"/>
+        </w:rPr>
+        <w:t xml:space="preserve">Most infections come from environmental exposure; person-to-person spread uncommon </w:t>
+      </w:r>
+      <w:r>
+        <w:rPr>
+          <w:b w:val="0"/>
+          <w:i w:val="0"/>
+        </w:rPr>
+        <w:t>Slide 38</w:t>
+      </w:r>
+      <w:r>
+        <w:rPr>
+          <w:b w:val="0"/>
+          <w:i w:val="0"/>
+        </w:rPr>
+        <w:t>Risk Factors</w:t>
+      </w:r>
+      <w:r>
+        <w:rPr>
+          <w:b w:val="0"/>
+          <w:i w:val="0"/>
+        </w:rPr>
+        <w:t xml:space="preserve">Bronchiectasis, chronic obstructive pulmonary disease, immune dysfunction </w:t>
+      </w:r>
+      <w:r>
+        <w:rPr>
+          <w:b w:val="0"/>
+          <w:i w:val="0"/>
+        </w:rPr>
+        <w:t>Slide 38</w:t>
+      </w:r>
+      <w:r>
+        <w:rPr>
+          <w:b w:val="0"/>
+          <w:i w:val="0"/>
+        </w:rPr>
+        <w:t>Pathology</w:t>
+      </w:r>
+      <w:r>
+        <w:rPr>
+          <w:b w:val="0"/>
+          <w:i w:val="0"/>
+        </w:rPr>
+        <w:t xml:space="preserve">Nodular bronchiectasis or fibrocavitary disease </w:t>
+      </w:r>
+      <w:r>
+        <w:rPr>
+          <w:b w:val="0"/>
+          <w:i w:val="0"/>
+        </w:rPr>
+        <w:t>Slide 39</w:t>
+      </w:r>
+      <w:r>
+        <w:rPr>
+          <w:b w:val="0"/>
+          <w:i w:val="0"/>
+        </w:rPr>
+        <w:t>Clinical Manifestation</w:t>
+      </w:r>
+      <w:r>
+        <w:rPr>
+          <w:b w:val="0"/>
+          <w:i w:val="0"/>
+        </w:rPr>
+        <w:t xml:space="preserve">Chronic cough and sputum, fatigue, weight loss, reduced appetite, dyspnea or hemoptysis </w:t>
+      </w:r>
+      <w:r>
+        <w:rPr>
+          <w:b w:val="0"/>
+          <w:i w:val="0"/>
+        </w:rPr>
+        <w:t>Slide 39</w:t>
+      </w:r>
+      <w:r>
+        <w:rPr>
+          <w:b w:val="0"/>
+          <w:i w:val="0"/>
+        </w:rPr>
+        <w:t>Diagnosis</w:t>
+      </w:r>
+      <w:r>
+        <w:rPr>
+          <w:b w:val="0"/>
+          <w:i w:val="0"/>
+          <w:highlight w:val="yellow"/>
+        </w:rPr>
+        <w:t>★ All domains: compatible symptoms and imaging, alternatives excluded, usually 2 or more sputum cultures of the same species</w:t>
+      </w:r>
+      <w:r>
+        <w:rPr>
+          <w:b w:val="0"/>
+          <w:i w:val="0"/>
+        </w:rPr>
+        <w:t xml:space="preserve"> (or one bronchial wash or lavage or a qualifying biopsy); an acid-fast smear cannot tell nontuberculous mycobacteria from tuberculosis </w:t>
+      </w:r>
+      <w:r>
+        <w:rPr>
+          <w:b w:val="0"/>
+          <w:i w:val="0"/>
+        </w:rPr>
+        <w:t>Slides 4, 39</w:t>
+      </w:r>
+      <w:r>
+        <w:rPr>
+          <w:b w:val="0"/>
+          <w:i w:val="0"/>
+        </w:rPr>
+        <w:t>Treatment/Therapy</w:t>
+      </w:r>
+      <w:r>
+        <w:rPr>
+          <w:b w:val="0"/>
+          <w:i w:val="0"/>
+        </w:rPr>
+        <w:t xml:space="preserve">Macrolide-susceptible MAC (specialist-directed): azithromycin, ethambutol and a rifamycin, at least 12 months after culture conversion; cavitary or severe: daily therapy and initial intravenous amikacin; persistent positive cultures after 6 months or more: inhaled liposomal amikacin; other species susceptibility-guided </w:t>
+      </w:r>
+      <w:r>
+        <w:rPr>
+          <w:b w:val="0"/>
+          <w:i w:val="0"/>
+        </w:rPr>
+        <w:t>Slide 40</w:t>
+      </w:r>
+      <w:r>
+        <w:rPr>
+          <w:b w:val="0"/>
+          <w:i w:val="0"/>
+        </w:rPr>
+        <w:t>Mortality ★</w:t>
+      </w:r>
+      <w:r>
+        <w:rPr>
+          <w:b w:val="0"/>
+          <w:i w:val="0"/>
+        </w:rPr>
+        <w:t>Not covered in the lecture</w:t>
       </w:r>
     </w:p>
     <w:sectPr>

</xml_diff>